<commit_message>
inicialización de módulos (frontend, backend, scannerQR)
</commit_message>
<xml_diff>
--- a/RequerimientosFuncionales.docx
+++ b/RequerimientosFuncionales.docx
@@ -22,77 +22,6 @@
       </w:pPr>
       <w:r>
         <w:rPr>
-          <w:noProof/>
-        </w:rPr>
-        <mc:AlternateContent>
-          <mc:Choice Requires="wps">
-            <w:drawing>
-              <wp:anchor distT="0" distB="0" distL="114300" distR="114300" simplePos="0" relativeHeight="251671552" behindDoc="0" locked="0" layoutInCell="1" allowOverlap="1" wp14:anchorId="695EC4E1" wp14:editId="480377C2">
-                <wp:simplePos x="0" y="0"/>
-                <wp:positionH relativeFrom="margin">
-                  <wp:align>right</wp:align>
-                </wp:positionH>
-                <wp:positionV relativeFrom="paragraph">
-                  <wp:posOffset>-1196023</wp:posOffset>
-                </wp:positionV>
-                <wp:extent cx="0" cy="4319905"/>
-                <wp:effectExtent l="0" t="26353" r="30798" b="30797"/>
-                <wp:wrapNone/>
-                <wp:docPr id="141142915" name="Straight Connector 10"/>
-                <wp:cNvGraphicFramePr/>
-                <a:graphic xmlns:a="http://schemas.openxmlformats.org/drawingml/2006/main">
-                  <a:graphicData uri="http://schemas.microsoft.com/office/word/2010/wordprocessingShape">
-                    <wps:wsp>
-                      <wps:cNvCnPr/>
-                      <wps:spPr>
-                        <a:xfrm rot="5400000">
-                          <a:off x="0" y="0"/>
-                          <a:ext cx="0" cy="4319905"/>
-                        </a:xfrm>
-                        <a:prstGeom prst="line">
-                          <a:avLst/>
-                        </a:prstGeom>
-                        <a:ln w="57150">
-                          <a:solidFill>
-                            <a:srgbClr val="003300"/>
-                          </a:solidFill>
-                          <a:prstDash val="solid"/>
-                          <a:bevel/>
-                        </a:ln>
-                      </wps:spPr>
-                      <wps:style>
-                        <a:lnRef idx="1">
-                          <a:schemeClr val="accent1"/>
-                        </a:lnRef>
-                        <a:fillRef idx="0">
-                          <a:schemeClr val="accent1"/>
-                        </a:fillRef>
-                        <a:effectRef idx="0">
-                          <a:schemeClr val="accent1"/>
-                        </a:effectRef>
-                        <a:fontRef idx="minor">
-                          <a:schemeClr val="tx1"/>
-                        </a:fontRef>
-                      </wps:style>
-                      <wps:bodyPr/>
-                    </wps:wsp>
-                  </a:graphicData>
-                </a:graphic>
-              </wp:anchor>
-            </w:drawing>
-          </mc:Choice>
-          <mc:Fallback>
-            <w:pict>
-              <v:line w14:anchorId="3347DD57" id="Straight Connector 10" o:spid="_x0000_s1026" style="position:absolute;rotation:90;z-index:251671552;visibility:visible;mso-wrap-style:square;mso-wrap-distance-left:9pt;mso-wrap-distance-top:0;mso-wrap-distance-right:9pt;mso-wrap-distance-bottom:0;mso-position-horizontal:right;mso-position-horizontal-relative:margin;mso-position-vertical:absolute;mso-position-vertical-relative:text" from="-51.2pt,-94.2pt" to="-51.2pt,245.95pt" o:gfxdata="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" strokecolor="#030" strokeweight="4.5pt">
-                <v:stroke joinstyle="bevel"/>
-                <w10:wrap anchorx="margin"/>
-              </v:line>
-            </w:pict>
-          </mc:Fallback>
-        </mc:AlternateContent>
-      </w:r>
-      <w:r>
-        <w:rPr>
           <w:rFonts w:ascii="Times New Roman" w:hAnsi="Times New Roman" w:cs="Times New Roman"/>
           <w:noProof/>
           <w:sz w:val="32"/>
@@ -102,10 +31,10 @@
         <mc:AlternateContent>
           <mc:Choice Requires="wps">
             <w:drawing>
-              <wp:anchor distT="0" distB="0" distL="114300" distR="114300" simplePos="0" relativeHeight="251661312" behindDoc="0" locked="0" layoutInCell="1" allowOverlap="1" wp14:anchorId="3565F7EC" wp14:editId="1B629AC0">
+              <wp:anchor distT="0" distB="0" distL="114300" distR="114300" simplePos="0" relativeHeight="251661312" behindDoc="0" locked="0" layoutInCell="1" allowOverlap="1" wp14:anchorId="3565F7EC" wp14:editId="77E1ADA4">
                 <wp:simplePos x="0" y="0"/>
                 <wp:positionH relativeFrom="page">
-                  <wp:posOffset>2279650</wp:posOffset>
+                  <wp:posOffset>2317750</wp:posOffset>
                 </wp:positionH>
                 <wp:positionV relativeFrom="margin">
                   <wp:align>top</wp:align>
@@ -270,7 +199,7 @@
                 <v:stroke joinstyle="miter"/>
                 <v:path gradientshapeok="t" o:connecttype="rect"/>
               </v:shapetype>
-              <v:shape id="Text Box 11" o:spid="_x0000_s1026" type="#_x0000_t202" style="position:absolute;left:0;text-align:left;margin-left:179.5pt;margin-top:0;width:406.2pt;height:114.7pt;z-index:251661312;visibility:visible;mso-wrap-style:square;mso-width-percent:0;mso-height-percent:0;mso-wrap-distance-left:9pt;mso-wrap-distance-top:0;mso-wrap-distance-right:9pt;mso-wrap-distance-bottom:0;mso-position-horizontal:absolute;mso-position-horizontal-relative:page;mso-position-vertical:top;mso-position-vertical-relative:margin;mso-width-percent:0;mso-height-percent:0;mso-width-relative:margin;mso-height-relative:margin;v-text-anchor:top" o:gfxdata="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" filled="f" stroked="f" strokeweight=".5pt">
+              <v:shape id="Text Box 11" o:spid="_x0000_s1026" type="#_x0000_t202" style="position:absolute;left:0;text-align:left;margin-left:182.5pt;margin-top:0;width:406.2pt;height:114.7pt;z-index:251661312;visibility:visible;mso-wrap-style:square;mso-width-percent:0;mso-height-percent:0;mso-wrap-distance-left:9pt;mso-wrap-distance-top:0;mso-wrap-distance-right:9pt;mso-wrap-distance-bottom:0;mso-position-horizontal:absolute;mso-position-horizontal-relative:page;mso-position-vertical:top;mso-position-vertical-relative:margin;mso-width-percent:0;mso-height-percent:0;mso-width-relative:margin;mso-height-relative:margin;v-text-anchor:top" o:gfxdata="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" filled="f" stroked="f" strokeweight=".5pt">
                 <v:textbox>
                   <w:txbxContent>
                     <w:p>
@@ -395,6 +324,77 @@
         <w:rPr>
           <w:noProof/>
         </w:rPr>
+        <mc:AlternateContent>
+          <mc:Choice Requires="wps">
+            <w:drawing>
+              <wp:anchor distT="0" distB="0" distL="114300" distR="114300" simplePos="0" relativeHeight="251671552" behindDoc="0" locked="0" layoutInCell="1" allowOverlap="1" wp14:anchorId="695EC4E1" wp14:editId="2BBA7802">
+                <wp:simplePos x="0" y="0"/>
+                <wp:positionH relativeFrom="margin">
+                  <wp:align>right</wp:align>
+                </wp:positionH>
+                <wp:positionV relativeFrom="paragraph">
+                  <wp:posOffset>-1196023</wp:posOffset>
+                </wp:positionV>
+                <wp:extent cx="0" cy="4319905"/>
+                <wp:effectExtent l="0" t="26353" r="30798" b="30797"/>
+                <wp:wrapNone/>
+                <wp:docPr id="141142915" name="Straight Connector 10"/>
+                <wp:cNvGraphicFramePr/>
+                <a:graphic xmlns:a="http://schemas.openxmlformats.org/drawingml/2006/main">
+                  <a:graphicData uri="http://schemas.microsoft.com/office/word/2010/wordprocessingShape">
+                    <wps:wsp>
+                      <wps:cNvCnPr/>
+                      <wps:spPr>
+                        <a:xfrm rot="5400000">
+                          <a:off x="0" y="0"/>
+                          <a:ext cx="0" cy="4319905"/>
+                        </a:xfrm>
+                        <a:prstGeom prst="line">
+                          <a:avLst/>
+                        </a:prstGeom>
+                        <a:ln w="57150">
+                          <a:solidFill>
+                            <a:srgbClr val="003300"/>
+                          </a:solidFill>
+                          <a:prstDash val="solid"/>
+                          <a:bevel/>
+                        </a:ln>
+                      </wps:spPr>
+                      <wps:style>
+                        <a:lnRef idx="1">
+                          <a:schemeClr val="accent1"/>
+                        </a:lnRef>
+                        <a:fillRef idx="0">
+                          <a:schemeClr val="accent1"/>
+                        </a:fillRef>
+                        <a:effectRef idx="0">
+                          <a:schemeClr val="accent1"/>
+                        </a:effectRef>
+                        <a:fontRef idx="minor">
+                          <a:schemeClr val="tx1"/>
+                        </a:fontRef>
+                      </wps:style>
+                      <wps:bodyPr/>
+                    </wps:wsp>
+                  </a:graphicData>
+                </a:graphic>
+              </wp:anchor>
+            </w:drawing>
+          </mc:Choice>
+          <mc:Fallback>
+            <w:pict>
+              <v:line w14:anchorId="2DDD33F5" id="Straight Connector 10" o:spid="_x0000_s1026" style="position:absolute;rotation:90;z-index:251671552;visibility:visible;mso-wrap-style:square;mso-wrap-distance-left:9pt;mso-wrap-distance-top:0;mso-wrap-distance-right:9pt;mso-wrap-distance-bottom:0;mso-position-horizontal:right;mso-position-horizontal-relative:margin;mso-position-vertical:absolute;mso-position-vertical-relative:text" from="-51.2pt,-94.2pt" to="-51.2pt,245.95pt" o:gfxdata="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" strokecolor="#030" strokeweight="4.5pt">
+                <v:stroke joinstyle="bevel"/>
+                <w10:wrap anchorx="margin"/>
+              </v:line>
+            </w:pict>
+          </mc:Fallback>
+        </mc:AlternateContent>
+      </w:r>
+      <w:r>
+        <w:rPr>
+          <w:noProof/>
+        </w:rPr>
         <w:drawing>
           <wp:anchor distT="0" distB="0" distL="114300" distR="114300" simplePos="0" relativeHeight="251662336" behindDoc="0" locked="0" layoutInCell="1" allowOverlap="1" wp14:anchorId="7C93F787" wp14:editId="0B6B221C">
             <wp:simplePos x="0" y="0"/>
@@ -457,12 +457,6 @@
             </wp14:sizeRelV>
           </wp:anchor>
         </w:drawing>
-      </w:r>
-      <w:r>
-        <w:rPr>
-          <w:noProof/>
-        </w:rPr>
-        <w:t>|</w:t>
       </w:r>
     </w:p>
     <w:p/>

</xml_diff>

<commit_message>
modificación de requerimientos funcionales
</commit_message>
<xml_diff>
--- a/RequerimientosFuncionales.docx
+++ b/RequerimientosFuncionales.docx
@@ -968,7 +968,7 @@
                                 <w:sz w:val="32"/>
                                 <w:szCs w:val="32"/>
                               </w:rPr>
-                              <w:t>Análisis de Proyecto</w:t>
+                              <w:t>Requerimientos Funcionales</w:t>
                             </w:r>
                           </w:p>
                           <w:p>
@@ -1577,7 +1577,7 @@
                           <w:sz w:val="32"/>
                           <w:szCs w:val="32"/>
                         </w:rPr>
-                        <w:t>Análisis de Proyecto</w:t>
+                        <w:t>Requerimientos Funcionales</w:t>
                       </w:r>
                     </w:p>
                     <w:p>
@@ -2076,370 +2076,561 @@
     </w:p>
     <w:p>
       <w:pPr>
-        <w:numPr>
-          <w:ilvl w:val="0"/>
-          <w:numId w:val="26"/>
-        </w:numPr>
+        <w:rPr>
+          <w:b/>
+          <w:bCs/>
+        </w:rPr>
       </w:pPr>
       <w:r>
-        <w:t>El sistema deberá permitir el registro de participantes mediante un formulario digital accesible desde dispositivos móviles y computadoras.</w:t>
+        <w:rPr>
+          <w:b/>
+          <w:bCs/>
+        </w:rPr>
+        <w:t>Requerimientos de Participante (Público)</w:t>
       </w:r>
     </w:p>
     <w:p>
       <w:pPr>
         <w:numPr>
           <w:ilvl w:val="0"/>
-          <w:numId w:val="26"/>
+          <w:numId w:val="31"/>
         </w:numPr>
       </w:pPr>
       <w:r>
-        <w:t>El sistema deberá generar automáticamente un número de folio único para cada participante registrado.</w:t>
+        <w:rPr>
+          <w:b/>
+          <w:bCs/>
+        </w:rPr>
+        <w:t>RFP-001 – Registro de Participación:</w:t>
+      </w:r>
+      <w:r>
+        <w:t xml:space="preserve"> El sistema deberá permitir al participante realizar su registro mediante un formulario con campos nombre, apellidos, teléfono, correo electrónico, género, talla, origen (Nacional, Estatal), municipio, estado, cuadra a la que pertenece, primera vez participando (Sí, No), veces que ha participado, solo o acompañado, cantidad de participantes, tipo de hospedaje (Airbnb, Hotel, Casa propia, de familiar y/o amigos), hotel al que llegará, días de estancia, recibir folio por (Correo electrónico, Número telefónico).</w:t>
       </w:r>
     </w:p>
     <w:p>
       <w:pPr>
         <w:numPr>
           <w:ilvl w:val="0"/>
-          <w:numId w:val="26"/>
+          <w:numId w:val="31"/>
         </w:numPr>
       </w:pPr>
       <w:r>
-        <w:t>El sistema deberá evitar la generación de folios duplicados en el registro de participantes.</w:t>
+        <w:rPr>
+          <w:b/>
+          <w:bCs/>
+        </w:rPr>
+        <w:t>RFP-002 - Consulta de Registro:</w:t>
+      </w:r>
+      <w:r>
+        <w:t xml:space="preserve"> El sistema deberá permitir al participante consultar su información personal de registro introduciendo su folio y correo electrónico.</w:t>
       </w:r>
     </w:p>
     <w:p>
       <w:pPr>
         <w:numPr>
           <w:ilvl w:val="0"/>
-          <w:numId w:val="26"/>
+          <w:numId w:val="31"/>
         </w:numPr>
       </w:pPr>
       <w:r>
-        <w:t>El sistema deberá generar automáticamente un código QR único asociado al folio de cada participante.</w:t>
+        <w:rPr>
+          <w:b/>
+          <w:bCs/>
+        </w:rPr>
+        <w:t>RFP-003 - Descarga de Comprobante:</w:t>
+      </w:r>
+      <w:r>
+        <w:t xml:space="preserve"> El sistema deberá permitir al participante la impresión o descarga directa de su código QR y número de folio desde el portal de consulta.</w:t>
       </w:r>
     </w:p>
     <w:p>
-      <w:pPr>
-        <w:numPr>
-          <w:ilvl w:val="0"/>
-          <w:numId w:val="26"/>
-        </w:numPr>
-      </w:pPr>
       <w:r>
-        <w:t>El sistema deberá incluir como contenido del código QR el folio único del participante.</w:t>
+        <w:rPr>
+          <w:b/>
+          <w:bCs/>
+        </w:rPr>
+        <w:t>Requerimientos del Personal de SECTURZ (Gestión Administrativa)</w:t>
       </w:r>
     </w:p>
     <w:p>
       <w:pPr>
         <w:numPr>
           <w:ilvl w:val="0"/>
-          <w:numId w:val="26"/>
+          <w:numId w:val="32"/>
         </w:numPr>
       </w:pPr>
       <w:r>
-        <w:t>El sistema deberá enviar automáticamente un correo electrónico al participante registrado con su número de folio y el código QR generado.</w:t>
+        <w:rPr>
+          <w:b/>
+          <w:bCs/>
+        </w:rPr>
+        <w:t>RFA-001 - Panel de Control:</w:t>
+      </w:r>
+      <w:r>
+        <w:t xml:space="preserve"> El sistema deberá permitir al Personal de SECTURZ la administración integral de los participantes registrados mediante un panel de control privado (Dashboard).</w:t>
       </w:r>
     </w:p>
     <w:p>
       <w:pPr>
         <w:numPr>
           <w:ilvl w:val="0"/>
-          <w:numId w:val="26"/>
+          <w:numId w:val="32"/>
         </w:numPr>
       </w:pPr>
       <w:r>
-        <w:t xml:space="preserve">(Sujeto a cambios) </w:t>
+        <w:rPr>
+          <w:b/>
+          <w:bCs/>
+        </w:rPr>
+        <w:t>RFA-002 - Búsqueda y Filtrado:</w:t>
       </w:r>
       <w:r>
-        <w:t>El sistema deberá permitir la integración opcional con WhatsApp para el envío del folio y código QR al número telefónico registrado.</w:t>
+        <w:t xml:space="preserve"> El sistema deberá permitir al Personal de SECTURZ la consulta de registros de participantes mediante filtros por folio, nombre, correo electrónico o número telefónico.</w:t>
       </w:r>
     </w:p>
     <w:p>
       <w:pPr>
         <w:numPr>
           <w:ilvl w:val="0"/>
-          <w:numId w:val="26"/>
+          <w:numId w:val="32"/>
         </w:numPr>
       </w:pPr>
       <w:r>
-        <w:t>El sistema deberá almacenar el estado de envío del correo electrónico de cada participante.</w:t>
+        <w:rPr>
+          <w:b/>
+          <w:bCs/>
+        </w:rPr>
+        <w:t>RFA-003 - Edición de Registros:</w:t>
+      </w:r>
+      <w:r>
+        <w:t xml:space="preserve"> El sistema deberá permitir al Personal de SECTURZ editar la información de los registros de los participantes antes de la realización del evento.</w:t>
       </w:r>
     </w:p>
     <w:p>
       <w:pPr>
         <w:numPr>
           <w:ilvl w:val="0"/>
-          <w:numId w:val="26"/>
+          <w:numId w:val="32"/>
         </w:numPr>
       </w:pPr>
       <w:r>
-        <w:t>El sistema deberá permitir la consulta de registros de participantes por folio, nombre, correo electrónico o número telefónico.</w:t>
+        <w:rPr>
+          <w:b/>
+          <w:bCs/>
+        </w:rPr>
+        <w:t>RFA-004 - Cancelación de Registros:</w:t>
+      </w:r>
+      <w:r>
+        <w:t xml:space="preserve"> El sistema deberá permitir al Personal de SECTURZ cancelar registros de participantes cuando sea necesario o solicitado.</w:t>
       </w:r>
     </w:p>
     <w:p>
       <w:pPr>
         <w:numPr>
           <w:ilvl w:val="0"/>
-          <w:numId w:val="26"/>
+          <w:numId w:val="32"/>
         </w:numPr>
       </w:pPr>
       <w:r>
-        <w:t>El sistema deberá permitir la exportación de los registros de participantes en formatos compatibles con hojas de cálculo.</w:t>
+        <w:rPr>
+          <w:b/>
+          <w:bCs/>
+        </w:rPr>
+        <w:lastRenderedPageBreak/>
+        <w:t>RFA-005 - Configuración de Campos:</w:t>
+      </w:r>
+      <w:r>
+        <w:t xml:space="preserve"> El sistema deberá permitir al Personal de SECTURZ configure los datos solicitados en el formulario de registro según las necesidades del evento.</w:t>
       </w:r>
     </w:p>
     <w:p>
       <w:pPr>
         <w:numPr>
           <w:ilvl w:val="0"/>
-          <w:numId w:val="26"/>
+          <w:numId w:val="32"/>
         </w:numPr>
       </w:pPr>
       <w:r>
-        <w:t>El sistema deberá permitir la impresión o descarga del código QR asociado a cada participante.</w:t>
+        <w:rPr>
+          <w:b/>
+          <w:bCs/>
+        </w:rPr>
+        <w:t>RFA-006 - Exportación de Datos:</w:t>
+      </w:r>
+      <w:r>
+        <w:t xml:space="preserve"> El sistema deberá permitir al Personal de SECTURZ la exportación de los registros de participantes en formatos compatibles con hojas de cálculo (ej. CSV, XLSX).</w:t>
       </w:r>
     </w:p>
     <w:p>
       <w:pPr>
         <w:numPr>
           <w:ilvl w:val="0"/>
-          <w:numId w:val="26"/>
+          <w:numId w:val="32"/>
         </w:numPr>
       </w:pPr>
       <w:r>
-        <w:t>El sistema deberá registrar la entrega de playeras asociando cada playera con el folio y QR del participante correspondiente.</w:t>
+        <w:rPr>
+          <w:b/>
+          <w:bCs/>
+        </w:rPr>
+        <w:t>RFA-007 - Monitoreo en Tiempo Real:</w:t>
+      </w:r>
+      <w:r>
+        <w:t xml:space="preserve"> El sistema deberá permitir al Personal de SECTURZ visualizar en tiempo real la lista de participantes que van registrando su asistencia en campo.</w:t>
       </w:r>
     </w:p>
     <w:p>
       <w:pPr>
         <w:numPr>
           <w:ilvl w:val="0"/>
-          <w:numId w:val="26"/>
+          <w:numId w:val="32"/>
         </w:numPr>
       </w:pPr>
       <w:r>
-        <w:t>El sistema deberá garantizar que cada código QR sea único e intransferible.</w:t>
+        <w:rPr>
+          <w:b/>
+          <w:bCs/>
+        </w:rPr>
+        <w:t>RFA-008 - Consulta Estadísticas:</w:t>
+      </w:r>
+      <w:r>
+        <w:t xml:space="preserve"> El sistema deberá permitir al Personal de SECTURZ consultar estadísticas gráficas de participantes registrados y asistentes confirmados.</w:t>
       </w:r>
     </w:p>
     <w:p>
       <w:pPr>
         <w:numPr>
           <w:ilvl w:val="0"/>
-          <w:numId w:val="26"/>
+          <w:numId w:val="32"/>
         </w:numPr>
       </w:pPr>
       <w:r>
-        <w:t>El sistema deberá contar con un módulo de escaneo de códigos QR para registrar la asistencia de los participantes el día de la cabalgata.</w:t>
+        <w:rPr>
+          <w:b/>
+          <w:bCs/>
+        </w:rPr>
+        <w:t>RFA-009 - Reportes de Asistencia:</w:t>
+      </w:r>
+      <w:r>
+        <w:t xml:space="preserve"> El sistema deberá permitir al Personal de SECTURZ generar reportes consolidados de participación y asistencia general de la cabalgata.</w:t>
       </w:r>
     </w:p>
     <w:p>
       <w:pPr>
         <w:numPr>
           <w:ilvl w:val="0"/>
-          <w:numId w:val="26"/>
+          <w:numId w:val="32"/>
         </w:numPr>
       </w:pPr>
       <w:r>
-        <w:lastRenderedPageBreak/>
-        <w:t>El sistema deberá validar automáticamente la autenticidad del código QR escaneado.</w:t>
+        <w:rPr>
+          <w:b/>
+          <w:bCs/>
+        </w:rPr>
+        <w:t>RFA-010 - Identificación de Inasistencias:</w:t>
+      </w:r>
+      <w:r>
+        <w:t xml:space="preserve"> El sistema deberá permitir al Personal de SECTURZ identificar y filtrar a los participantes que se inscribieron pero no realizaron el registro de asistencia el día del evento.</w:t>
       </w:r>
     </w:p>
     <w:p>
-      <w:pPr>
-        <w:numPr>
-          <w:ilvl w:val="0"/>
-          <w:numId w:val="26"/>
-        </w:numPr>
-      </w:pPr>
       <w:r>
-        <w:t>El sistema deberá identificar si un código QR ya fue escaneado previamente.</w:t>
+        <w:rPr>
+          <w:b/>
+          <w:bCs/>
+        </w:rPr>
+        <w:t>Requerimientos del Personal de Campo (Módulo de Escaneo Móvil)</w:t>
       </w:r>
     </w:p>
     <w:p>
       <w:pPr>
         <w:numPr>
           <w:ilvl w:val="0"/>
-          <w:numId w:val="26"/>
+          <w:numId w:val="33"/>
         </w:numPr>
       </w:pPr>
       <w:r>
-        <w:t>El sistema deberá impedir registros duplicados de asistencia mediante el bloqueo de múltiples escaneos del mismo código QR.</w:t>
+        <w:rPr>
+          <w:b/>
+          <w:bCs/>
+        </w:rPr>
+        <w:t>RFPC-001 - Escaneo Multidispositivo:</w:t>
+      </w:r>
+      <w:r>
+        <w:t xml:space="preserve"> El sistema deberá permitir al Personal de Campo operar el módulo de escaneo de códigos QR desde dispositivos móviles.</w:t>
       </w:r>
     </w:p>
     <w:p>
       <w:pPr>
         <w:numPr>
           <w:ilvl w:val="0"/>
-          <w:numId w:val="26"/>
+          <w:numId w:val="33"/>
         </w:numPr>
       </w:pPr>
       <w:r>
-        <w:t>El sistema deberá enviar automáticamente la información del participante y su folio a una hoja de Google Sheets al momento de validar el escaneo.</w:t>
+        <w:rPr>
+          <w:b/>
+          <w:bCs/>
+        </w:rPr>
+        <w:t>RFPC-002 - Historial de Captura:</w:t>
+      </w:r>
+      <w:r>
+        <w:t xml:space="preserve"> El sistema deberá permitir al Personal de Staff visualizar el historial de los últimos escaneos realizados de forma local durante el operativo de acceso.</w:t>
       </w:r>
     </w:p>
     <w:p>
-      <w:pPr>
-        <w:numPr>
-          <w:ilvl w:val="0"/>
-          <w:numId w:val="26"/>
-        </w:numPr>
-      </w:pPr>
       <w:r>
-        <w:t>El sistema deberá mantener sincronizada la información de asistencia registrada con Google Sheets.</w:t>
+        <w:rPr>
+          <w:b/>
+          <w:bCs/>
+        </w:rPr>
+        <w:t>Requerimientos de Lógica y Automatización (Sistema / Backend)</w:t>
       </w:r>
     </w:p>
     <w:p>
       <w:pPr>
         <w:numPr>
           <w:ilvl w:val="0"/>
-          <w:numId w:val="26"/>
+          <w:numId w:val="34"/>
         </w:numPr>
       </w:pPr>
       <w:r>
-        <w:t>El sistema deberá permitir visualizar en tiempo real la lista de participantes que ya realizaron su registro de asistencia.</w:t>
+        <w:rPr>
+          <w:b/>
+          <w:bCs/>
+        </w:rPr>
+        <w:t>RFSYS-001 - Generación de Folio:</w:t>
+      </w:r>
+      <w:r>
+        <w:t xml:space="preserve"> El sistema deberá generar automáticamente un número de folio único e irrepetible para cada participante registrado de manera interna.</w:t>
       </w:r>
     </w:p>
     <w:p>
       <w:pPr>
         <w:numPr>
           <w:ilvl w:val="0"/>
-          <w:numId w:val="26"/>
+          <w:numId w:val="34"/>
         </w:numPr>
       </w:pPr>
       <w:r>
-        <w:t>El sistema deberá permitir la administración de participantes registrados mediante un panel de control.</w:t>
+        <w:rPr>
+          <w:b/>
+          <w:bCs/>
+        </w:rPr>
+        <w:lastRenderedPageBreak/>
+        <w:t>RFSYS-002 - Control de Duplicados en Registro:</w:t>
+      </w:r>
+      <w:r>
+        <w:t xml:space="preserve"> El sistema deberá evitar registros duplicados utilizando validaciones automatizadas de correo electrónico, teléfono o CURP antes de procesar una inscripción.</w:t>
       </w:r>
     </w:p>
     <w:p>
       <w:pPr>
         <w:numPr>
           <w:ilvl w:val="0"/>
-          <w:numId w:val="26"/>
+          <w:numId w:val="34"/>
         </w:numPr>
       </w:pPr>
       <w:r>
-        <w:t>El sistema deberá permitir editar o corregir información de registros antes del evento.</w:t>
+        <w:rPr>
+          <w:b/>
+          <w:bCs/>
+        </w:rPr>
+        <w:t>RFSYS-003 - Validaciones de Formulario:</w:t>
+      </w:r>
+      <w:r>
+        <w:t xml:space="preserve"> El sistema deberá contar con validaciones obligatorias en el formulario web para impedir el envío de registros incompletos o con datos sintácticamente inválidos.</w:t>
       </w:r>
     </w:p>
     <w:p>
       <w:pPr>
         <w:numPr>
           <w:ilvl w:val="0"/>
-          <w:numId w:val="26"/>
+          <w:numId w:val="34"/>
         </w:numPr>
       </w:pPr>
       <w:r>
-        <w:t>El sistema deberá permitir cancelar o desactivar registros de participantes cuando sea necesario.</w:t>
+        <w:rPr>
+          <w:b/>
+          <w:bCs/>
+        </w:rPr>
+        <w:t>RFSYS-004 - Codificación del QR:</w:t>
+      </w:r>
+      <w:r>
+        <w:t xml:space="preserve"> El sistema deberá generar automáticamente un código QR dinámico y único cuyo contenido sea estrictamente el folio asignado al participante.</w:t>
       </w:r>
     </w:p>
     <w:p>
       <w:pPr>
         <w:numPr>
           <w:ilvl w:val="0"/>
-          <w:numId w:val="26"/>
+          <w:numId w:val="34"/>
         </w:numPr>
       </w:pPr>
       <w:r>
-        <w:t>El sistema deberá garantizar la persistencia y disponibilidad de los registros y asistencias durante el evento.</w:t>
+        <w:rPr>
+          <w:b/>
+          <w:bCs/>
+        </w:rPr>
+        <w:t>RFSYS-005 - Despacho de Correo Electrónico:</w:t>
+      </w:r>
+      <w:r>
+        <w:t xml:space="preserve"> El sistema deberá enviar automáticamente un correo electrónico al participante inscrito adjuntando de manera clara su número de folio y el código QR generado.</w:t>
       </w:r>
     </w:p>
     <w:p>
       <w:pPr>
         <w:numPr>
           <w:ilvl w:val="0"/>
-          <w:numId w:val="26"/>
+          <w:numId w:val="34"/>
         </w:numPr>
       </w:pPr>
       <w:r>
-        <w:t>El sistema deberá permitir el funcionamiento del módulo de escaneo desde dispositivos móviles con cámara.</w:t>
+        <w:rPr>
+          <w:b/>
+          <w:bCs/>
+        </w:rPr>
+        <w:t>RFSYS-006 - Bitácora de Notificación:</w:t>
+      </w:r>
+      <w:r>
+        <w:t xml:space="preserve"> El sistema deberá almacenar internamente en la base de datos el estado de envío (Exitoso / Fallido) del correo electrónico de cada participante.</w:t>
       </w:r>
     </w:p>
     <w:p>
       <w:pPr>
         <w:numPr>
           <w:ilvl w:val="0"/>
-          <w:numId w:val="26"/>
+          <w:numId w:val="34"/>
         </w:numPr>
       </w:pPr>
       <w:r>
-        <w:t>El sistema deberá generar reportes de participación y asistencia de la cabalgata.</w:t>
+        <w:rPr>
+          <w:b/>
+          <w:bCs/>
+        </w:rPr>
+        <w:t>RFSYS-007 - Integración Opcional (WhatsApp):</w:t>
+      </w:r>
+      <w:r>
+        <w:t xml:space="preserve"> </w:t>
+      </w:r>
+      <w:r>
+        <w:rPr>
+          <w:i/>
+          <w:iCs/>
+        </w:rPr>
+        <w:t>(Sujeto a cambios)</w:t>
+      </w:r>
+      <w:r>
+        <w:t xml:space="preserve"> El sistema deberá permitir la integración técnica opcional con la API de WhatsApp para el envío alternativo del folio y código QR al número telefónico registrado.</w:t>
       </w:r>
     </w:p>
     <w:p>
       <w:pPr>
         <w:numPr>
           <w:ilvl w:val="0"/>
-          <w:numId w:val="26"/>
+          <w:numId w:val="34"/>
         </w:numPr>
       </w:pPr>
       <w:r>
-        <w:t>El sistema deberá permitir consultar estadísticas de participantes registrados y asistentes confirmados.</w:t>
+        <w:rPr>
+          <w:b/>
+          <w:bCs/>
+        </w:rPr>
+        <w:t>RFSYS-008 - Validación de Autenticidad QR:</w:t>
+      </w:r>
+      <w:r>
+        <w:t xml:space="preserve"> El sistema deberá validar automáticamente la autenticidad del código QR escaneado, comprobando que pertenezca a la base de datos oficial del evento.</w:t>
       </w:r>
     </w:p>
     <w:p>
       <w:pPr>
         <w:numPr>
           <w:ilvl w:val="0"/>
-          <w:numId w:val="26"/>
+          <w:numId w:val="34"/>
         </w:numPr>
       </w:pPr>
       <w:r>
-        <w:t>El sistema deberá permitir identificar participantes que no realizaron el registro de asistencia el día del evento.</w:t>
+        <w:rPr>
+          <w:b/>
+          <w:bCs/>
+        </w:rPr>
+        <w:t>RFSYS-009 - Detección de Duplicados en Escaneo:</w:t>
+      </w:r>
+      <w:r>
+        <w:t xml:space="preserve"> El sistema deberá identificar de forma inmediata si un código QR ya fue escaneado previamente en los puntos de acceso.</w:t>
       </w:r>
     </w:p>
     <w:p>
       <w:pPr>
         <w:numPr>
           <w:ilvl w:val="0"/>
-          <w:numId w:val="26"/>
+          <w:numId w:val="34"/>
         </w:numPr>
       </w:pPr>
       <w:r>
-        <w:t>El sistema deberá contar con validaciones obligatorias en el formulario para evitar registros incompletos o inválidos.</w:t>
+        <w:rPr>
+          <w:b/>
+          <w:bCs/>
+        </w:rPr>
+        <w:t>RFSYS-010 - Bloqueo de Re-escaneo:</w:t>
+      </w:r>
+      <w:r>
+        <w:t xml:space="preserve"> El sistema deberá impedir registros duplicados de asistencia mediante el bloqueo lógico de múltiples escaneos asociados al mismo código QR.</w:t>
       </w:r>
     </w:p>
     <w:p>
       <w:pPr>
         <w:numPr>
           <w:ilvl w:val="0"/>
-          <w:numId w:val="26"/>
+          <w:numId w:val="34"/>
         </w:numPr>
       </w:pPr>
       <w:r>
+        <w:rPr>
+          <w:b/>
+          <w:bCs/>
+        </w:rPr>
         <w:lastRenderedPageBreak/>
-        <w:t>El sistema deberá evitar registros duplicados utilizando validaciones de correo electrónico, teléfono o datos definidos por la organización.</w:t>
+        <w:t>RFSYS-011 - Sincronización con Google Sheets:</w:t>
+      </w:r>
+      <w:r>
+        <w:t xml:space="preserve"> El sistema deberá enviar automáticamente la información del participante, su folio y estampa de tiempo a una hoja de Google Sheets al momento de validar con éxito el escaneo.</w:t>
       </w:r>
     </w:p>
     <w:p>
       <w:pPr>
         <w:numPr>
           <w:ilvl w:val="0"/>
-          <w:numId w:val="26"/>
+          <w:numId w:val="34"/>
         </w:numPr>
       </w:pPr>
       <w:r>
-        <w:t>El sistema deberá permitir configurar los datos solicitados en el formulario de registro según las necesidades del evento.</w:t>
+        <w:rPr>
+          <w:b/>
+          <w:bCs/>
+        </w:rPr>
+        <w:t>RFSYS-012 - Integridad de Datos en Tiempo Real:</w:t>
+      </w:r>
+      <w:r>
+        <w:t xml:space="preserve"> El sistema deberá mantener sincronizada y protegida la información de asistencia registrada con la hoja de cálculo de Google Sheets de manera bidireccional si es requerido.</w:t>
       </w:r>
     </w:p>
     <w:p>
       <w:pPr>
         <w:numPr>
           <w:ilvl w:val="0"/>
-          <w:numId w:val="26"/>
+          <w:numId w:val="34"/>
         </w:numPr>
       </w:pPr>
       <w:r>
-        <w:t>El sistema deberá permitir visualizar el historial de escaneos realizados durante el evento.</w:t>
+        <w:rPr>
+          <w:b/>
+          <w:bCs/>
+        </w:rPr>
+        <w:t>RFSYS-013 - Persistencia Crítica:</w:t>
       </w:r>
-    </w:p>
-    <w:p>
-      <w:pPr>
-        <w:numPr>
-          <w:ilvl w:val="0"/>
-          <w:numId w:val="26"/>
-        </w:numPr>
-      </w:pPr>
       <w:r>
-        <w:t>El sistema deberá permitir realizar pruebas de escaneo y validación antes del día oficial de la cabalgata.</w:t>
+        <w:t xml:space="preserve"> El sistema deberá garantizar la alta persistencia y disponibilidad de las transacciones de los registros y asistencias frente a caídas de red durante el día del evento.</w:t>
       </w:r>
     </w:p>
     <w:p/>
@@ -2568,6 +2759,155 @@
 <file path=word/numbering.xml><?xml version="1.0" encoding="utf-8"?>
 <w:numbering xmlns:wpc="http://schemas.microsoft.com/office/word/2010/wordprocessingCanvas" xmlns:cx="http://schemas.microsoft.com/office/drawing/2014/chartex" xmlns:cx1="http://schemas.microsoft.com/office/drawing/2015/9/8/chartex" xmlns:cx2="http://schemas.microsoft.com/office/drawing/2015/10/21/chartex" xmlns:cx3="http://schemas.microsoft.com/office/drawing/2016/5/9/chartex" xmlns:cx4="http://schemas.microsoft.com/office/drawing/2016/5/10/chartex" xmlns:cx5="http://schemas.microsoft.com/office/drawing/2016/5/11/chartex" xmlns:cx6="http://schemas.microsoft.com/office/drawing/2016/5/12/chartex" xmlns:cx7="http://schemas.microsoft.com/office/drawing/2016/5/13/chartex" xmlns:cx8="http://schemas.microsoft.com/office/drawing/2016/5/14/chartex" xmlns:mc="http://schemas.openxmlformats.org/markup-compatibility/2006" xmlns:aink="http://schemas.microsoft.com/office/drawing/2016/ink" xmlns:am3d="http://schemas.microsoft.com/office/drawing/2017/model3d" xmlns:o="urn:schemas-microsoft-com:office:office" xmlns:oel="http://schemas.microsoft.com/office/2019/extlst" xmlns:r="http://schemas.openxmlformats.org/officeDocument/2006/relationships" xmlns:m="http://schemas.openxmlformats.org/officeDocument/2006/math" xmlns:v="urn:schemas-microsoft-com:vml" xmlns:wp14="http://schemas.microsoft.com/office/word/2010/wordprocessingDrawing" xmlns:wp="http://schemas.openxmlformats.org/drawingml/2006/wordprocessingDrawing" xmlns:w10="urn:schemas-microsoft-com:office:word" xmlns:w="http://schemas.openxmlformats.org/wordprocessingml/2006/main" xmlns:w14="http://schemas.microsoft.com/office/word/2010/wordml" xmlns:w15="http://schemas.microsoft.com/office/word/2012/wordml" xmlns:w16cex="http://schemas.microsoft.com/office/word/2018/wordml/cex" xmlns:w16cid="http://schemas.microsoft.com/office/word/2016/wordml/cid" xmlns:w16="http://schemas.microsoft.com/office/word/2018/wordml" xmlns:w16du="http://schemas.microsoft.com/office/word/2023/wordml/word16du" xmlns:w16sdtdh="http://schemas.microsoft.com/office/word/2020/wordml/sdtdatahash" xmlns:w16sdtfl="http://schemas.microsoft.com/office/word/2024/wordml/sdtformatlock" xmlns:w16se="http://schemas.microsoft.com/office/word/2015/wordml/symex" xmlns:wpg="http://schemas.microsoft.com/office/word/2010/wordprocessingGroup" xmlns:wpi="http://schemas.microsoft.com/office/word/2010/wordprocessingInk" xmlns:wne="http://schemas.microsoft.com/office/word/2006/wordml" xmlns:wps="http://schemas.microsoft.com/office/word/2010/wordprocessingShape" mc:Ignorable="w14 w15 w16se w16cid w16 w16cex w16sdtdh w16sdtfl w16du wp14">
   <w:abstractNum w:abstractNumId="0" w15:restartNumberingAfterBreak="0">
+    <w:nsid w:val="009B58E3"/>
+    <w:multiLevelType w:val="multilevel"/>
+    <w:tmpl w:val="A78AE1F0"/>
+    <w:lvl w:ilvl="0">
+      <w:start w:val="1"/>
+      <w:numFmt w:val="bullet"/>
+      <w:lvlText w:val=""/>
+      <w:lvlJc w:val="left"/>
+      <w:pPr>
+        <w:tabs>
+          <w:tab w:val="num" w:pos="720"/>
+        </w:tabs>
+        <w:ind w:left="720" w:hanging="360"/>
+      </w:pPr>
+      <w:rPr>
+        <w:rFonts w:ascii="Symbol" w:hAnsi="Symbol" w:hint="default"/>
+        <w:sz w:val="20"/>
+      </w:rPr>
+    </w:lvl>
+    <w:lvl w:ilvl="1" w:tentative="1">
+      <w:start w:val="1"/>
+      <w:numFmt w:val="bullet"/>
+      <w:lvlText w:val="o"/>
+      <w:lvlJc w:val="left"/>
+      <w:pPr>
+        <w:tabs>
+          <w:tab w:val="num" w:pos="1440"/>
+        </w:tabs>
+        <w:ind w:left="1440" w:hanging="360"/>
+      </w:pPr>
+      <w:rPr>
+        <w:rFonts w:ascii="Courier New" w:hAnsi="Courier New" w:hint="default"/>
+        <w:sz w:val="20"/>
+      </w:rPr>
+    </w:lvl>
+    <w:lvl w:ilvl="2" w:tentative="1">
+      <w:start w:val="1"/>
+      <w:numFmt w:val="bullet"/>
+      <w:lvlText w:val=""/>
+      <w:lvlJc w:val="left"/>
+      <w:pPr>
+        <w:tabs>
+          <w:tab w:val="num" w:pos="2160"/>
+        </w:tabs>
+        <w:ind w:left="2160" w:hanging="360"/>
+      </w:pPr>
+      <w:rPr>
+        <w:rFonts w:ascii="Wingdings" w:hAnsi="Wingdings" w:hint="default"/>
+        <w:sz w:val="20"/>
+      </w:rPr>
+    </w:lvl>
+    <w:lvl w:ilvl="3" w:tentative="1">
+      <w:start w:val="1"/>
+      <w:numFmt w:val="bullet"/>
+      <w:lvlText w:val=""/>
+      <w:lvlJc w:val="left"/>
+      <w:pPr>
+        <w:tabs>
+          <w:tab w:val="num" w:pos="2880"/>
+        </w:tabs>
+        <w:ind w:left="2880" w:hanging="360"/>
+      </w:pPr>
+      <w:rPr>
+        <w:rFonts w:ascii="Wingdings" w:hAnsi="Wingdings" w:hint="default"/>
+        <w:sz w:val="20"/>
+      </w:rPr>
+    </w:lvl>
+    <w:lvl w:ilvl="4" w:tentative="1">
+      <w:start w:val="1"/>
+      <w:numFmt w:val="bullet"/>
+      <w:lvlText w:val=""/>
+      <w:lvlJc w:val="left"/>
+      <w:pPr>
+        <w:tabs>
+          <w:tab w:val="num" w:pos="3600"/>
+        </w:tabs>
+        <w:ind w:left="3600" w:hanging="360"/>
+      </w:pPr>
+      <w:rPr>
+        <w:rFonts w:ascii="Wingdings" w:hAnsi="Wingdings" w:hint="default"/>
+        <w:sz w:val="20"/>
+      </w:rPr>
+    </w:lvl>
+    <w:lvl w:ilvl="5" w:tentative="1">
+      <w:start w:val="1"/>
+      <w:numFmt w:val="bullet"/>
+      <w:lvlText w:val=""/>
+      <w:lvlJc w:val="left"/>
+      <w:pPr>
+        <w:tabs>
+          <w:tab w:val="num" w:pos="4320"/>
+        </w:tabs>
+        <w:ind w:left="4320" w:hanging="360"/>
+      </w:pPr>
+      <w:rPr>
+        <w:rFonts w:ascii="Wingdings" w:hAnsi="Wingdings" w:hint="default"/>
+        <w:sz w:val="20"/>
+      </w:rPr>
+    </w:lvl>
+    <w:lvl w:ilvl="6" w:tentative="1">
+      <w:start w:val="1"/>
+      <w:numFmt w:val="bullet"/>
+      <w:lvlText w:val=""/>
+      <w:lvlJc w:val="left"/>
+      <w:pPr>
+        <w:tabs>
+          <w:tab w:val="num" w:pos="5040"/>
+        </w:tabs>
+        <w:ind w:left="5040" w:hanging="360"/>
+      </w:pPr>
+      <w:rPr>
+        <w:rFonts w:ascii="Wingdings" w:hAnsi="Wingdings" w:hint="default"/>
+        <w:sz w:val="20"/>
+      </w:rPr>
+    </w:lvl>
+    <w:lvl w:ilvl="7" w:tentative="1">
+      <w:start w:val="1"/>
+      <w:numFmt w:val="bullet"/>
+      <w:lvlText w:val=""/>
+      <w:lvlJc w:val="left"/>
+      <w:pPr>
+        <w:tabs>
+          <w:tab w:val="num" w:pos="5760"/>
+        </w:tabs>
+        <w:ind w:left="5760" w:hanging="360"/>
+      </w:pPr>
+      <w:rPr>
+        <w:rFonts w:ascii="Wingdings" w:hAnsi="Wingdings" w:hint="default"/>
+        <w:sz w:val="20"/>
+      </w:rPr>
+    </w:lvl>
+    <w:lvl w:ilvl="8" w:tentative="1">
+      <w:start w:val="1"/>
+      <w:numFmt w:val="bullet"/>
+      <w:lvlText w:val=""/>
+      <w:lvlJc w:val="left"/>
+      <w:pPr>
+        <w:tabs>
+          <w:tab w:val="num" w:pos="6480"/>
+        </w:tabs>
+        <w:ind w:left="6480" w:hanging="360"/>
+      </w:pPr>
+      <w:rPr>
+        <w:rFonts w:ascii="Wingdings" w:hAnsi="Wingdings" w:hint="default"/>
+        <w:sz w:val="20"/>
+      </w:rPr>
+    </w:lvl>
+  </w:abstractNum>
+  <w:abstractNum w:abstractNumId="1" w15:restartNumberingAfterBreak="0">
     <w:nsid w:val="00AC69F4"/>
     <w:multiLevelType w:val="multilevel"/>
     <w:tmpl w:val="E3B06186"/>
@@ -2716,7 +3056,7 @@
       </w:rPr>
     </w:lvl>
   </w:abstractNum>
-  <w:abstractNum w:abstractNumId="1" w15:restartNumberingAfterBreak="0">
+  <w:abstractNum w:abstractNumId="2" w15:restartNumberingAfterBreak="0">
     <w:nsid w:val="033524F3"/>
     <w:multiLevelType w:val="multilevel"/>
     <w:tmpl w:val="80304F14"/>
@@ -2865,7 +3205,305 @@
       </w:rPr>
     </w:lvl>
   </w:abstractNum>
-  <w:abstractNum w:abstractNumId="2" w15:restartNumberingAfterBreak="0">
+  <w:abstractNum w:abstractNumId="3" w15:restartNumberingAfterBreak="0">
+    <w:nsid w:val="076F5E8F"/>
+    <w:multiLevelType w:val="multilevel"/>
+    <w:tmpl w:val="D9AA03B6"/>
+    <w:lvl w:ilvl="0">
+      <w:start w:val="1"/>
+      <w:numFmt w:val="bullet"/>
+      <w:lvlText w:val=""/>
+      <w:lvlJc w:val="left"/>
+      <w:pPr>
+        <w:tabs>
+          <w:tab w:val="num" w:pos="720"/>
+        </w:tabs>
+        <w:ind w:left="720" w:hanging="360"/>
+      </w:pPr>
+      <w:rPr>
+        <w:rFonts w:ascii="Symbol" w:hAnsi="Symbol" w:hint="default"/>
+        <w:sz w:val="20"/>
+      </w:rPr>
+    </w:lvl>
+    <w:lvl w:ilvl="1" w:tentative="1">
+      <w:start w:val="1"/>
+      <w:numFmt w:val="bullet"/>
+      <w:lvlText w:val="o"/>
+      <w:lvlJc w:val="left"/>
+      <w:pPr>
+        <w:tabs>
+          <w:tab w:val="num" w:pos="1440"/>
+        </w:tabs>
+        <w:ind w:left="1440" w:hanging="360"/>
+      </w:pPr>
+      <w:rPr>
+        <w:rFonts w:ascii="Courier New" w:hAnsi="Courier New" w:hint="default"/>
+        <w:sz w:val="20"/>
+      </w:rPr>
+    </w:lvl>
+    <w:lvl w:ilvl="2" w:tentative="1">
+      <w:start w:val="1"/>
+      <w:numFmt w:val="bullet"/>
+      <w:lvlText w:val=""/>
+      <w:lvlJc w:val="left"/>
+      <w:pPr>
+        <w:tabs>
+          <w:tab w:val="num" w:pos="2160"/>
+        </w:tabs>
+        <w:ind w:left="2160" w:hanging="360"/>
+      </w:pPr>
+      <w:rPr>
+        <w:rFonts w:ascii="Wingdings" w:hAnsi="Wingdings" w:hint="default"/>
+        <w:sz w:val="20"/>
+      </w:rPr>
+    </w:lvl>
+    <w:lvl w:ilvl="3" w:tentative="1">
+      <w:start w:val="1"/>
+      <w:numFmt w:val="bullet"/>
+      <w:lvlText w:val=""/>
+      <w:lvlJc w:val="left"/>
+      <w:pPr>
+        <w:tabs>
+          <w:tab w:val="num" w:pos="2880"/>
+        </w:tabs>
+        <w:ind w:left="2880" w:hanging="360"/>
+      </w:pPr>
+      <w:rPr>
+        <w:rFonts w:ascii="Wingdings" w:hAnsi="Wingdings" w:hint="default"/>
+        <w:sz w:val="20"/>
+      </w:rPr>
+    </w:lvl>
+    <w:lvl w:ilvl="4" w:tentative="1">
+      <w:start w:val="1"/>
+      <w:numFmt w:val="bullet"/>
+      <w:lvlText w:val=""/>
+      <w:lvlJc w:val="left"/>
+      <w:pPr>
+        <w:tabs>
+          <w:tab w:val="num" w:pos="3600"/>
+        </w:tabs>
+        <w:ind w:left="3600" w:hanging="360"/>
+      </w:pPr>
+      <w:rPr>
+        <w:rFonts w:ascii="Wingdings" w:hAnsi="Wingdings" w:hint="default"/>
+        <w:sz w:val="20"/>
+      </w:rPr>
+    </w:lvl>
+    <w:lvl w:ilvl="5" w:tentative="1">
+      <w:start w:val="1"/>
+      <w:numFmt w:val="bullet"/>
+      <w:lvlText w:val=""/>
+      <w:lvlJc w:val="left"/>
+      <w:pPr>
+        <w:tabs>
+          <w:tab w:val="num" w:pos="4320"/>
+        </w:tabs>
+        <w:ind w:left="4320" w:hanging="360"/>
+      </w:pPr>
+      <w:rPr>
+        <w:rFonts w:ascii="Wingdings" w:hAnsi="Wingdings" w:hint="default"/>
+        <w:sz w:val="20"/>
+      </w:rPr>
+    </w:lvl>
+    <w:lvl w:ilvl="6" w:tentative="1">
+      <w:start w:val="1"/>
+      <w:numFmt w:val="bullet"/>
+      <w:lvlText w:val=""/>
+      <w:lvlJc w:val="left"/>
+      <w:pPr>
+        <w:tabs>
+          <w:tab w:val="num" w:pos="5040"/>
+        </w:tabs>
+        <w:ind w:left="5040" w:hanging="360"/>
+      </w:pPr>
+      <w:rPr>
+        <w:rFonts w:ascii="Wingdings" w:hAnsi="Wingdings" w:hint="default"/>
+        <w:sz w:val="20"/>
+      </w:rPr>
+    </w:lvl>
+    <w:lvl w:ilvl="7" w:tentative="1">
+      <w:start w:val="1"/>
+      <w:numFmt w:val="bullet"/>
+      <w:lvlText w:val=""/>
+      <w:lvlJc w:val="left"/>
+      <w:pPr>
+        <w:tabs>
+          <w:tab w:val="num" w:pos="5760"/>
+        </w:tabs>
+        <w:ind w:left="5760" w:hanging="360"/>
+      </w:pPr>
+      <w:rPr>
+        <w:rFonts w:ascii="Wingdings" w:hAnsi="Wingdings" w:hint="default"/>
+        <w:sz w:val="20"/>
+      </w:rPr>
+    </w:lvl>
+    <w:lvl w:ilvl="8" w:tentative="1">
+      <w:start w:val="1"/>
+      <w:numFmt w:val="bullet"/>
+      <w:lvlText w:val=""/>
+      <w:lvlJc w:val="left"/>
+      <w:pPr>
+        <w:tabs>
+          <w:tab w:val="num" w:pos="6480"/>
+        </w:tabs>
+        <w:ind w:left="6480" w:hanging="360"/>
+      </w:pPr>
+      <w:rPr>
+        <w:rFonts w:ascii="Wingdings" w:hAnsi="Wingdings" w:hint="default"/>
+        <w:sz w:val="20"/>
+      </w:rPr>
+    </w:lvl>
+  </w:abstractNum>
+  <w:abstractNum w:abstractNumId="4" w15:restartNumberingAfterBreak="0">
+    <w:nsid w:val="07B14175"/>
+    <w:multiLevelType w:val="multilevel"/>
+    <w:tmpl w:val="ECC26582"/>
+    <w:lvl w:ilvl="0">
+      <w:start w:val="1"/>
+      <w:numFmt w:val="bullet"/>
+      <w:lvlText w:val=""/>
+      <w:lvlJc w:val="left"/>
+      <w:pPr>
+        <w:tabs>
+          <w:tab w:val="num" w:pos="720"/>
+        </w:tabs>
+        <w:ind w:left="720" w:hanging="360"/>
+      </w:pPr>
+      <w:rPr>
+        <w:rFonts w:ascii="Symbol" w:hAnsi="Symbol" w:hint="default"/>
+        <w:sz w:val="20"/>
+      </w:rPr>
+    </w:lvl>
+    <w:lvl w:ilvl="1" w:tentative="1">
+      <w:start w:val="1"/>
+      <w:numFmt w:val="bullet"/>
+      <w:lvlText w:val="o"/>
+      <w:lvlJc w:val="left"/>
+      <w:pPr>
+        <w:tabs>
+          <w:tab w:val="num" w:pos="1440"/>
+        </w:tabs>
+        <w:ind w:left="1440" w:hanging="360"/>
+      </w:pPr>
+      <w:rPr>
+        <w:rFonts w:ascii="Courier New" w:hAnsi="Courier New" w:hint="default"/>
+        <w:sz w:val="20"/>
+      </w:rPr>
+    </w:lvl>
+    <w:lvl w:ilvl="2" w:tentative="1">
+      <w:start w:val="1"/>
+      <w:numFmt w:val="bullet"/>
+      <w:lvlText w:val=""/>
+      <w:lvlJc w:val="left"/>
+      <w:pPr>
+        <w:tabs>
+          <w:tab w:val="num" w:pos="2160"/>
+        </w:tabs>
+        <w:ind w:left="2160" w:hanging="360"/>
+      </w:pPr>
+      <w:rPr>
+        <w:rFonts w:ascii="Wingdings" w:hAnsi="Wingdings" w:hint="default"/>
+        <w:sz w:val="20"/>
+      </w:rPr>
+    </w:lvl>
+    <w:lvl w:ilvl="3" w:tentative="1">
+      <w:start w:val="1"/>
+      <w:numFmt w:val="bullet"/>
+      <w:lvlText w:val=""/>
+      <w:lvlJc w:val="left"/>
+      <w:pPr>
+        <w:tabs>
+          <w:tab w:val="num" w:pos="2880"/>
+        </w:tabs>
+        <w:ind w:left="2880" w:hanging="360"/>
+      </w:pPr>
+      <w:rPr>
+        <w:rFonts w:ascii="Wingdings" w:hAnsi="Wingdings" w:hint="default"/>
+        <w:sz w:val="20"/>
+      </w:rPr>
+    </w:lvl>
+    <w:lvl w:ilvl="4" w:tentative="1">
+      <w:start w:val="1"/>
+      <w:numFmt w:val="bullet"/>
+      <w:lvlText w:val=""/>
+      <w:lvlJc w:val="left"/>
+      <w:pPr>
+        <w:tabs>
+          <w:tab w:val="num" w:pos="3600"/>
+        </w:tabs>
+        <w:ind w:left="3600" w:hanging="360"/>
+      </w:pPr>
+      <w:rPr>
+        <w:rFonts w:ascii="Wingdings" w:hAnsi="Wingdings" w:hint="default"/>
+        <w:sz w:val="20"/>
+      </w:rPr>
+    </w:lvl>
+    <w:lvl w:ilvl="5" w:tentative="1">
+      <w:start w:val="1"/>
+      <w:numFmt w:val="bullet"/>
+      <w:lvlText w:val=""/>
+      <w:lvlJc w:val="left"/>
+      <w:pPr>
+        <w:tabs>
+          <w:tab w:val="num" w:pos="4320"/>
+        </w:tabs>
+        <w:ind w:left="4320" w:hanging="360"/>
+      </w:pPr>
+      <w:rPr>
+        <w:rFonts w:ascii="Wingdings" w:hAnsi="Wingdings" w:hint="default"/>
+        <w:sz w:val="20"/>
+      </w:rPr>
+    </w:lvl>
+    <w:lvl w:ilvl="6" w:tentative="1">
+      <w:start w:val="1"/>
+      <w:numFmt w:val="bullet"/>
+      <w:lvlText w:val=""/>
+      <w:lvlJc w:val="left"/>
+      <w:pPr>
+        <w:tabs>
+          <w:tab w:val="num" w:pos="5040"/>
+        </w:tabs>
+        <w:ind w:left="5040" w:hanging="360"/>
+      </w:pPr>
+      <w:rPr>
+        <w:rFonts w:ascii="Wingdings" w:hAnsi="Wingdings" w:hint="default"/>
+        <w:sz w:val="20"/>
+      </w:rPr>
+    </w:lvl>
+    <w:lvl w:ilvl="7" w:tentative="1">
+      <w:start w:val="1"/>
+      <w:numFmt w:val="bullet"/>
+      <w:lvlText w:val=""/>
+      <w:lvlJc w:val="left"/>
+      <w:pPr>
+        <w:tabs>
+          <w:tab w:val="num" w:pos="5760"/>
+        </w:tabs>
+        <w:ind w:left="5760" w:hanging="360"/>
+      </w:pPr>
+      <w:rPr>
+        <w:rFonts w:ascii="Wingdings" w:hAnsi="Wingdings" w:hint="default"/>
+        <w:sz w:val="20"/>
+      </w:rPr>
+    </w:lvl>
+    <w:lvl w:ilvl="8" w:tentative="1">
+      <w:start w:val="1"/>
+      <w:numFmt w:val="bullet"/>
+      <w:lvlText w:val=""/>
+      <w:lvlJc w:val="left"/>
+      <w:pPr>
+        <w:tabs>
+          <w:tab w:val="num" w:pos="6480"/>
+        </w:tabs>
+        <w:ind w:left="6480" w:hanging="360"/>
+      </w:pPr>
+      <w:rPr>
+        <w:rFonts w:ascii="Wingdings" w:hAnsi="Wingdings" w:hint="default"/>
+        <w:sz w:val="20"/>
+      </w:rPr>
+    </w:lvl>
+  </w:abstractNum>
+  <w:abstractNum w:abstractNumId="5" w15:restartNumberingAfterBreak="0">
     <w:nsid w:val="100553D6"/>
     <w:multiLevelType w:val="multilevel"/>
     <w:tmpl w:val="E076C8E0"/>
@@ -3014,7 +3652,7 @@
       </w:rPr>
     </w:lvl>
   </w:abstractNum>
-  <w:abstractNum w:abstractNumId="3" w15:restartNumberingAfterBreak="0">
+  <w:abstractNum w:abstractNumId="6" w15:restartNumberingAfterBreak="0">
     <w:nsid w:val="154D646C"/>
     <w:multiLevelType w:val="multilevel"/>
     <w:tmpl w:val="8BDAB746"/>
@@ -3163,7 +3801,7 @@
       </w:rPr>
     </w:lvl>
   </w:abstractNum>
-  <w:abstractNum w:abstractNumId="4" w15:restartNumberingAfterBreak="0">
+  <w:abstractNum w:abstractNumId="7" w15:restartNumberingAfterBreak="0">
     <w:nsid w:val="163346B0"/>
     <w:multiLevelType w:val="multilevel"/>
     <w:tmpl w:val="FFB4373A"/>
@@ -3312,7 +3950,7 @@
       </w:rPr>
     </w:lvl>
   </w:abstractNum>
-  <w:abstractNum w:abstractNumId="5" w15:restartNumberingAfterBreak="0">
+  <w:abstractNum w:abstractNumId="8" w15:restartNumberingAfterBreak="0">
     <w:nsid w:val="1B391FC0"/>
     <w:multiLevelType w:val="multilevel"/>
     <w:tmpl w:val="6CAEA9B2"/>
@@ -3461,7 +4099,7 @@
       </w:rPr>
     </w:lvl>
   </w:abstractNum>
-  <w:abstractNum w:abstractNumId="6" w15:restartNumberingAfterBreak="0">
+  <w:abstractNum w:abstractNumId="9" w15:restartNumberingAfterBreak="0">
     <w:nsid w:val="22F12FFF"/>
     <w:multiLevelType w:val="multilevel"/>
     <w:tmpl w:val="1A48B972"/>
@@ -3610,7 +4248,156 @@
       </w:rPr>
     </w:lvl>
   </w:abstractNum>
-  <w:abstractNum w:abstractNumId="7" w15:restartNumberingAfterBreak="0">
+  <w:abstractNum w:abstractNumId="10" w15:restartNumberingAfterBreak="0">
+    <w:nsid w:val="23E12EC5"/>
+    <w:multiLevelType w:val="multilevel"/>
+    <w:tmpl w:val="EED2B55C"/>
+    <w:lvl w:ilvl="0">
+      <w:start w:val="1"/>
+      <w:numFmt w:val="bullet"/>
+      <w:lvlText w:val=""/>
+      <w:lvlJc w:val="left"/>
+      <w:pPr>
+        <w:tabs>
+          <w:tab w:val="num" w:pos="720"/>
+        </w:tabs>
+        <w:ind w:left="720" w:hanging="360"/>
+      </w:pPr>
+      <w:rPr>
+        <w:rFonts w:ascii="Symbol" w:hAnsi="Symbol" w:hint="default"/>
+        <w:sz w:val="20"/>
+      </w:rPr>
+    </w:lvl>
+    <w:lvl w:ilvl="1" w:tentative="1">
+      <w:start w:val="1"/>
+      <w:numFmt w:val="bullet"/>
+      <w:lvlText w:val="o"/>
+      <w:lvlJc w:val="left"/>
+      <w:pPr>
+        <w:tabs>
+          <w:tab w:val="num" w:pos="1440"/>
+        </w:tabs>
+        <w:ind w:left="1440" w:hanging="360"/>
+      </w:pPr>
+      <w:rPr>
+        <w:rFonts w:ascii="Courier New" w:hAnsi="Courier New" w:hint="default"/>
+        <w:sz w:val="20"/>
+      </w:rPr>
+    </w:lvl>
+    <w:lvl w:ilvl="2" w:tentative="1">
+      <w:start w:val="1"/>
+      <w:numFmt w:val="bullet"/>
+      <w:lvlText w:val=""/>
+      <w:lvlJc w:val="left"/>
+      <w:pPr>
+        <w:tabs>
+          <w:tab w:val="num" w:pos="2160"/>
+        </w:tabs>
+        <w:ind w:left="2160" w:hanging="360"/>
+      </w:pPr>
+      <w:rPr>
+        <w:rFonts w:ascii="Wingdings" w:hAnsi="Wingdings" w:hint="default"/>
+        <w:sz w:val="20"/>
+      </w:rPr>
+    </w:lvl>
+    <w:lvl w:ilvl="3" w:tentative="1">
+      <w:start w:val="1"/>
+      <w:numFmt w:val="bullet"/>
+      <w:lvlText w:val=""/>
+      <w:lvlJc w:val="left"/>
+      <w:pPr>
+        <w:tabs>
+          <w:tab w:val="num" w:pos="2880"/>
+        </w:tabs>
+        <w:ind w:left="2880" w:hanging="360"/>
+      </w:pPr>
+      <w:rPr>
+        <w:rFonts w:ascii="Wingdings" w:hAnsi="Wingdings" w:hint="default"/>
+        <w:sz w:val="20"/>
+      </w:rPr>
+    </w:lvl>
+    <w:lvl w:ilvl="4" w:tentative="1">
+      <w:start w:val="1"/>
+      <w:numFmt w:val="bullet"/>
+      <w:lvlText w:val=""/>
+      <w:lvlJc w:val="left"/>
+      <w:pPr>
+        <w:tabs>
+          <w:tab w:val="num" w:pos="3600"/>
+        </w:tabs>
+        <w:ind w:left="3600" w:hanging="360"/>
+      </w:pPr>
+      <w:rPr>
+        <w:rFonts w:ascii="Wingdings" w:hAnsi="Wingdings" w:hint="default"/>
+        <w:sz w:val="20"/>
+      </w:rPr>
+    </w:lvl>
+    <w:lvl w:ilvl="5" w:tentative="1">
+      <w:start w:val="1"/>
+      <w:numFmt w:val="bullet"/>
+      <w:lvlText w:val=""/>
+      <w:lvlJc w:val="left"/>
+      <w:pPr>
+        <w:tabs>
+          <w:tab w:val="num" w:pos="4320"/>
+        </w:tabs>
+        <w:ind w:left="4320" w:hanging="360"/>
+      </w:pPr>
+      <w:rPr>
+        <w:rFonts w:ascii="Wingdings" w:hAnsi="Wingdings" w:hint="default"/>
+        <w:sz w:val="20"/>
+      </w:rPr>
+    </w:lvl>
+    <w:lvl w:ilvl="6" w:tentative="1">
+      <w:start w:val="1"/>
+      <w:numFmt w:val="bullet"/>
+      <w:lvlText w:val=""/>
+      <w:lvlJc w:val="left"/>
+      <w:pPr>
+        <w:tabs>
+          <w:tab w:val="num" w:pos="5040"/>
+        </w:tabs>
+        <w:ind w:left="5040" w:hanging="360"/>
+      </w:pPr>
+      <w:rPr>
+        <w:rFonts w:ascii="Wingdings" w:hAnsi="Wingdings" w:hint="default"/>
+        <w:sz w:val="20"/>
+      </w:rPr>
+    </w:lvl>
+    <w:lvl w:ilvl="7" w:tentative="1">
+      <w:start w:val="1"/>
+      <w:numFmt w:val="bullet"/>
+      <w:lvlText w:val=""/>
+      <w:lvlJc w:val="left"/>
+      <w:pPr>
+        <w:tabs>
+          <w:tab w:val="num" w:pos="5760"/>
+        </w:tabs>
+        <w:ind w:left="5760" w:hanging="360"/>
+      </w:pPr>
+      <w:rPr>
+        <w:rFonts w:ascii="Wingdings" w:hAnsi="Wingdings" w:hint="default"/>
+        <w:sz w:val="20"/>
+      </w:rPr>
+    </w:lvl>
+    <w:lvl w:ilvl="8" w:tentative="1">
+      <w:start w:val="1"/>
+      <w:numFmt w:val="bullet"/>
+      <w:lvlText w:val=""/>
+      <w:lvlJc w:val="left"/>
+      <w:pPr>
+        <w:tabs>
+          <w:tab w:val="num" w:pos="6480"/>
+        </w:tabs>
+        <w:ind w:left="6480" w:hanging="360"/>
+      </w:pPr>
+      <w:rPr>
+        <w:rFonts w:ascii="Wingdings" w:hAnsi="Wingdings" w:hint="default"/>
+        <w:sz w:val="20"/>
+      </w:rPr>
+    </w:lvl>
+  </w:abstractNum>
+  <w:abstractNum w:abstractNumId="11" w15:restartNumberingAfterBreak="0">
     <w:nsid w:val="2B4B18B6"/>
     <w:multiLevelType w:val="multilevel"/>
     <w:tmpl w:val="6C6E45AC"/>
@@ -3759,7 +4546,7 @@
       </w:rPr>
     </w:lvl>
   </w:abstractNum>
-  <w:abstractNum w:abstractNumId="8" w15:restartNumberingAfterBreak="0">
+  <w:abstractNum w:abstractNumId="12" w15:restartNumberingAfterBreak="0">
     <w:nsid w:val="2B8A1AF5"/>
     <w:multiLevelType w:val="multilevel"/>
     <w:tmpl w:val="9A5E8846"/>
@@ -3908,7 +4695,156 @@
       </w:rPr>
     </w:lvl>
   </w:abstractNum>
-  <w:abstractNum w:abstractNumId="9" w15:restartNumberingAfterBreak="0">
+  <w:abstractNum w:abstractNumId="13" w15:restartNumberingAfterBreak="0">
+    <w:nsid w:val="2C3A6F53"/>
+    <w:multiLevelType w:val="multilevel"/>
+    <w:tmpl w:val="2640F304"/>
+    <w:lvl w:ilvl="0">
+      <w:start w:val="1"/>
+      <w:numFmt w:val="bullet"/>
+      <w:lvlText w:val=""/>
+      <w:lvlJc w:val="left"/>
+      <w:pPr>
+        <w:tabs>
+          <w:tab w:val="num" w:pos="720"/>
+        </w:tabs>
+        <w:ind w:left="720" w:hanging="360"/>
+      </w:pPr>
+      <w:rPr>
+        <w:rFonts w:ascii="Symbol" w:hAnsi="Symbol" w:hint="default"/>
+        <w:sz w:val="20"/>
+      </w:rPr>
+    </w:lvl>
+    <w:lvl w:ilvl="1" w:tentative="1">
+      <w:start w:val="1"/>
+      <w:numFmt w:val="bullet"/>
+      <w:lvlText w:val="o"/>
+      <w:lvlJc w:val="left"/>
+      <w:pPr>
+        <w:tabs>
+          <w:tab w:val="num" w:pos="1440"/>
+        </w:tabs>
+        <w:ind w:left="1440" w:hanging="360"/>
+      </w:pPr>
+      <w:rPr>
+        <w:rFonts w:ascii="Courier New" w:hAnsi="Courier New" w:hint="default"/>
+        <w:sz w:val="20"/>
+      </w:rPr>
+    </w:lvl>
+    <w:lvl w:ilvl="2" w:tentative="1">
+      <w:start w:val="1"/>
+      <w:numFmt w:val="bullet"/>
+      <w:lvlText w:val=""/>
+      <w:lvlJc w:val="left"/>
+      <w:pPr>
+        <w:tabs>
+          <w:tab w:val="num" w:pos="2160"/>
+        </w:tabs>
+        <w:ind w:left="2160" w:hanging="360"/>
+      </w:pPr>
+      <w:rPr>
+        <w:rFonts w:ascii="Wingdings" w:hAnsi="Wingdings" w:hint="default"/>
+        <w:sz w:val="20"/>
+      </w:rPr>
+    </w:lvl>
+    <w:lvl w:ilvl="3" w:tentative="1">
+      <w:start w:val="1"/>
+      <w:numFmt w:val="bullet"/>
+      <w:lvlText w:val=""/>
+      <w:lvlJc w:val="left"/>
+      <w:pPr>
+        <w:tabs>
+          <w:tab w:val="num" w:pos="2880"/>
+        </w:tabs>
+        <w:ind w:left="2880" w:hanging="360"/>
+      </w:pPr>
+      <w:rPr>
+        <w:rFonts w:ascii="Wingdings" w:hAnsi="Wingdings" w:hint="default"/>
+        <w:sz w:val="20"/>
+      </w:rPr>
+    </w:lvl>
+    <w:lvl w:ilvl="4" w:tentative="1">
+      <w:start w:val="1"/>
+      <w:numFmt w:val="bullet"/>
+      <w:lvlText w:val=""/>
+      <w:lvlJc w:val="left"/>
+      <w:pPr>
+        <w:tabs>
+          <w:tab w:val="num" w:pos="3600"/>
+        </w:tabs>
+        <w:ind w:left="3600" w:hanging="360"/>
+      </w:pPr>
+      <w:rPr>
+        <w:rFonts w:ascii="Wingdings" w:hAnsi="Wingdings" w:hint="default"/>
+        <w:sz w:val="20"/>
+      </w:rPr>
+    </w:lvl>
+    <w:lvl w:ilvl="5" w:tentative="1">
+      <w:start w:val="1"/>
+      <w:numFmt w:val="bullet"/>
+      <w:lvlText w:val=""/>
+      <w:lvlJc w:val="left"/>
+      <w:pPr>
+        <w:tabs>
+          <w:tab w:val="num" w:pos="4320"/>
+        </w:tabs>
+        <w:ind w:left="4320" w:hanging="360"/>
+      </w:pPr>
+      <w:rPr>
+        <w:rFonts w:ascii="Wingdings" w:hAnsi="Wingdings" w:hint="default"/>
+        <w:sz w:val="20"/>
+      </w:rPr>
+    </w:lvl>
+    <w:lvl w:ilvl="6" w:tentative="1">
+      <w:start w:val="1"/>
+      <w:numFmt w:val="bullet"/>
+      <w:lvlText w:val=""/>
+      <w:lvlJc w:val="left"/>
+      <w:pPr>
+        <w:tabs>
+          <w:tab w:val="num" w:pos="5040"/>
+        </w:tabs>
+        <w:ind w:left="5040" w:hanging="360"/>
+      </w:pPr>
+      <w:rPr>
+        <w:rFonts w:ascii="Wingdings" w:hAnsi="Wingdings" w:hint="default"/>
+        <w:sz w:val="20"/>
+      </w:rPr>
+    </w:lvl>
+    <w:lvl w:ilvl="7" w:tentative="1">
+      <w:start w:val="1"/>
+      <w:numFmt w:val="bullet"/>
+      <w:lvlText w:val=""/>
+      <w:lvlJc w:val="left"/>
+      <w:pPr>
+        <w:tabs>
+          <w:tab w:val="num" w:pos="5760"/>
+        </w:tabs>
+        <w:ind w:left="5760" w:hanging="360"/>
+      </w:pPr>
+      <w:rPr>
+        <w:rFonts w:ascii="Wingdings" w:hAnsi="Wingdings" w:hint="default"/>
+        <w:sz w:val="20"/>
+      </w:rPr>
+    </w:lvl>
+    <w:lvl w:ilvl="8" w:tentative="1">
+      <w:start w:val="1"/>
+      <w:numFmt w:val="bullet"/>
+      <w:lvlText w:val=""/>
+      <w:lvlJc w:val="left"/>
+      <w:pPr>
+        <w:tabs>
+          <w:tab w:val="num" w:pos="6480"/>
+        </w:tabs>
+        <w:ind w:left="6480" w:hanging="360"/>
+      </w:pPr>
+      <w:rPr>
+        <w:rFonts w:ascii="Wingdings" w:hAnsi="Wingdings" w:hint="default"/>
+        <w:sz w:val="20"/>
+      </w:rPr>
+    </w:lvl>
+  </w:abstractNum>
+  <w:abstractNum w:abstractNumId="14" w15:restartNumberingAfterBreak="0">
     <w:nsid w:val="2C6E2F90"/>
     <w:multiLevelType w:val="multilevel"/>
     <w:tmpl w:val="BD421C8E"/>
@@ -4057,7 +4993,7 @@
       </w:rPr>
     </w:lvl>
   </w:abstractNum>
-  <w:abstractNum w:abstractNumId="10" w15:restartNumberingAfterBreak="0">
+  <w:abstractNum w:abstractNumId="15" w15:restartNumberingAfterBreak="0">
     <w:nsid w:val="2E3F71F1"/>
     <w:multiLevelType w:val="multilevel"/>
     <w:tmpl w:val="FD74ED80"/>
@@ -4206,7 +5142,7 @@
       </w:rPr>
     </w:lvl>
   </w:abstractNum>
-  <w:abstractNum w:abstractNumId="11" w15:restartNumberingAfterBreak="0">
+  <w:abstractNum w:abstractNumId="16" w15:restartNumberingAfterBreak="0">
     <w:nsid w:val="31537342"/>
     <w:multiLevelType w:val="multilevel"/>
     <w:tmpl w:val="F4144EAE"/>
@@ -4355,7 +5291,7 @@
       </w:rPr>
     </w:lvl>
   </w:abstractNum>
-  <w:abstractNum w:abstractNumId="12" w15:restartNumberingAfterBreak="0">
+  <w:abstractNum w:abstractNumId="17" w15:restartNumberingAfterBreak="0">
     <w:nsid w:val="32174A8C"/>
     <w:multiLevelType w:val="multilevel"/>
     <w:tmpl w:val="3F003262"/>
@@ -4504,7 +5440,7 @@
       </w:rPr>
     </w:lvl>
   </w:abstractNum>
-  <w:abstractNum w:abstractNumId="13" w15:restartNumberingAfterBreak="0">
+  <w:abstractNum w:abstractNumId="18" w15:restartNumberingAfterBreak="0">
     <w:nsid w:val="33532F99"/>
     <w:multiLevelType w:val="multilevel"/>
     <w:tmpl w:val="66727B04"/>
@@ -4653,7 +5589,7 @@
       </w:rPr>
     </w:lvl>
   </w:abstractNum>
-  <w:abstractNum w:abstractNumId="14" w15:restartNumberingAfterBreak="0">
+  <w:abstractNum w:abstractNumId="19" w15:restartNumberingAfterBreak="0">
     <w:nsid w:val="448B4848"/>
     <w:multiLevelType w:val="multilevel"/>
     <w:tmpl w:val="90DCDB96"/>
@@ -4766,7 +5702,7 @@
       </w:pPr>
     </w:lvl>
   </w:abstractNum>
-  <w:abstractNum w:abstractNumId="15" w15:restartNumberingAfterBreak="0">
+  <w:abstractNum w:abstractNumId="20" w15:restartNumberingAfterBreak="0">
     <w:nsid w:val="51236B15"/>
     <w:multiLevelType w:val="multilevel"/>
     <w:tmpl w:val="A64095B0"/>
@@ -4915,7 +5851,7 @@
       </w:rPr>
     </w:lvl>
   </w:abstractNum>
-  <w:abstractNum w:abstractNumId="16" w15:restartNumberingAfterBreak="0">
+  <w:abstractNum w:abstractNumId="21" w15:restartNumberingAfterBreak="0">
     <w:nsid w:val="566811C7"/>
     <w:multiLevelType w:val="multilevel"/>
     <w:tmpl w:val="59F69060"/>
@@ -5064,7 +6000,7 @@
       </w:rPr>
     </w:lvl>
   </w:abstractNum>
-  <w:abstractNum w:abstractNumId="17" w15:restartNumberingAfterBreak="0">
+  <w:abstractNum w:abstractNumId="22" w15:restartNumberingAfterBreak="0">
     <w:nsid w:val="600D1A1D"/>
     <w:multiLevelType w:val="multilevel"/>
     <w:tmpl w:val="EF401F30"/>
@@ -5213,7 +6149,7 @@
       </w:rPr>
     </w:lvl>
   </w:abstractNum>
-  <w:abstractNum w:abstractNumId="18" w15:restartNumberingAfterBreak="0">
+  <w:abstractNum w:abstractNumId="23" w15:restartNumberingAfterBreak="0">
     <w:nsid w:val="667B4EF8"/>
     <w:multiLevelType w:val="multilevel"/>
     <w:tmpl w:val="93186208"/>
@@ -5362,7 +6298,156 @@
       </w:rPr>
     </w:lvl>
   </w:abstractNum>
-  <w:abstractNum w:abstractNumId="19" w15:restartNumberingAfterBreak="0">
+  <w:abstractNum w:abstractNumId="24" w15:restartNumberingAfterBreak="0">
+    <w:nsid w:val="66AF1BD6"/>
+    <w:multiLevelType w:val="multilevel"/>
+    <w:tmpl w:val="500414F6"/>
+    <w:lvl w:ilvl="0">
+      <w:start w:val="1"/>
+      <w:numFmt w:val="bullet"/>
+      <w:lvlText w:val=""/>
+      <w:lvlJc w:val="left"/>
+      <w:pPr>
+        <w:tabs>
+          <w:tab w:val="num" w:pos="720"/>
+        </w:tabs>
+        <w:ind w:left="720" w:hanging="360"/>
+      </w:pPr>
+      <w:rPr>
+        <w:rFonts w:ascii="Symbol" w:hAnsi="Symbol" w:hint="default"/>
+        <w:sz w:val="20"/>
+      </w:rPr>
+    </w:lvl>
+    <w:lvl w:ilvl="1" w:tentative="1">
+      <w:start w:val="1"/>
+      <w:numFmt w:val="bullet"/>
+      <w:lvlText w:val="o"/>
+      <w:lvlJc w:val="left"/>
+      <w:pPr>
+        <w:tabs>
+          <w:tab w:val="num" w:pos="1440"/>
+        </w:tabs>
+        <w:ind w:left="1440" w:hanging="360"/>
+      </w:pPr>
+      <w:rPr>
+        <w:rFonts w:ascii="Courier New" w:hAnsi="Courier New" w:hint="default"/>
+        <w:sz w:val="20"/>
+      </w:rPr>
+    </w:lvl>
+    <w:lvl w:ilvl="2" w:tentative="1">
+      <w:start w:val="1"/>
+      <w:numFmt w:val="bullet"/>
+      <w:lvlText w:val=""/>
+      <w:lvlJc w:val="left"/>
+      <w:pPr>
+        <w:tabs>
+          <w:tab w:val="num" w:pos="2160"/>
+        </w:tabs>
+        <w:ind w:left="2160" w:hanging="360"/>
+      </w:pPr>
+      <w:rPr>
+        <w:rFonts w:ascii="Wingdings" w:hAnsi="Wingdings" w:hint="default"/>
+        <w:sz w:val="20"/>
+      </w:rPr>
+    </w:lvl>
+    <w:lvl w:ilvl="3" w:tentative="1">
+      <w:start w:val="1"/>
+      <w:numFmt w:val="bullet"/>
+      <w:lvlText w:val=""/>
+      <w:lvlJc w:val="left"/>
+      <w:pPr>
+        <w:tabs>
+          <w:tab w:val="num" w:pos="2880"/>
+        </w:tabs>
+        <w:ind w:left="2880" w:hanging="360"/>
+      </w:pPr>
+      <w:rPr>
+        <w:rFonts w:ascii="Wingdings" w:hAnsi="Wingdings" w:hint="default"/>
+        <w:sz w:val="20"/>
+      </w:rPr>
+    </w:lvl>
+    <w:lvl w:ilvl="4" w:tentative="1">
+      <w:start w:val="1"/>
+      <w:numFmt w:val="bullet"/>
+      <w:lvlText w:val=""/>
+      <w:lvlJc w:val="left"/>
+      <w:pPr>
+        <w:tabs>
+          <w:tab w:val="num" w:pos="3600"/>
+        </w:tabs>
+        <w:ind w:left="3600" w:hanging="360"/>
+      </w:pPr>
+      <w:rPr>
+        <w:rFonts w:ascii="Wingdings" w:hAnsi="Wingdings" w:hint="default"/>
+        <w:sz w:val="20"/>
+      </w:rPr>
+    </w:lvl>
+    <w:lvl w:ilvl="5" w:tentative="1">
+      <w:start w:val="1"/>
+      <w:numFmt w:val="bullet"/>
+      <w:lvlText w:val=""/>
+      <w:lvlJc w:val="left"/>
+      <w:pPr>
+        <w:tabs>
+          <w:tab w:val="num" w:pos="4320"/>
+        </w:tabs>
+        <w:ind w:left="4320" w:hanging="360"/>
+      </w:pPr>
+      <w:rPr>
+        <w:rFonts w:ascii="Wingdings" w:hAnsi="Wingdings" w:hint="default"/>
+        <w:sz w:val="20"/>
+      </w:rPr>
+    </w:lvl>
+    <w:lvl w:ilvl="6" w:tentative="1">
+      <w:start w:val="1"/>
+      <w:numFmt w:val="bullet"/>
+      <w:lvlText w:val=""/>
+      <w:lvlJc w:val="left"/>
+      <w:pPr>
+        <w:tabs>
+          <w:tab w:val="num" w:pos="5040"/>
+        </w:tabs>
+        <w:ind w:left="5040" w:hanging="360"/>
+      </w:pPr>
+      <w:rPr>
+        <w:rFonts w:ascii="Wingdings" w:hAnsi="Wingdings" w:hint="default"/>
+        <w:sz w:val="20"/>
+      </w:rPr>
+    </w:lvl>
+    <w:lvl w:ilvl="7" w:tentative="1">
+      <w:start w:val="1"/>
+      <w:numFmt w:val="bullet"/>
+      <w:lvlText w:val=""/>
+      <w:lvlJc w:val="left"/>
+      <w:pPr>
+        <w:tabs>
+          <w:tab w:val="num" w:pos="5760"/>
+        </w:tabs>
+        <w:ind w:left="5760" w:hanging="360"/>
+      </w:pPr>
+      <w:rPr>
+        <w:rFonts w:ascii="Wingdings" w:hAnsi="Wingdings" w:hint="default"/>
+        <w:sz w:val="20"/>
+      </w:rPr>
+    </w:lvl>
+    <w:lvl w:ilvl="8" w:tentative="1">
+      <w:start w:val="1"/>
+      <w:numFmt w:val="bullet"/>
+      <w:lvlText w:val=""/>
+      <w:lvlJc w:val="left"/>
+      <w:pPr>
+        <w:tabs>
+          <w:tab w:val="num" w:pos="6480"/>
+        </w:tabs>
+        <w:ind w:left="6480" w:hanging="360"/>
+      </w:pPr>
+      <w:rPr>
+        <w:rFonts w:ascii="Wingdings" w:hAnsi="Wingdings" w:hint="default"/>
+        <w:sz w:val="20"/>
+      </w:rPr>
+    </w:lvl>
+  </w:abstractNum>
+  <w:abstractNum w:abstractNumId="25" w15:restartNumberingAfterBreak="0">
     <w:nsid w:val="6A2723A1"/>
     <w:multiLevelType w:val="multilevel"/>
     <w:tmpl w:val="3716A0F8"/>
@@ -5511,7 +6596,7 @@
       </w:rPr>
     </w:lvl>
   </w:abstractNum>
-  <w:abstractNum w:abstractNumId="20" w15:restartNumberingAfterBreak="0">
+  <w:abstractNum w:abstractNumId="26" w15:restartNumberingAfterBreak="0">
     <w:nsid w:val="6AB90FCC"/>
     <w:multiLevelType w:val="multilevel"/>
     <w:tmpl w:val="9520560E"/>
@@ -5660,7 +6745,7 @@
       </w:rPr>
     </w:lvl>
   </w:abstractNum>
-  <w:abstractNum w:abstractNumId="21" w15:restartNumberingAfterBreak="0">
+  <w:abstractNum w:abstractNumId="27" w15:restartNumberingAfterBreak="0">
     <w:nsid w:val="6B574274"/>
     <w:multiLevelType w:val="hybridMultilevel"/>
     <w:tmpl w:val="6FD47D0A"/>
@@ -5772,7 +6857,7 @@
       </w:rPr>
     </w:lvl>
   </w:abstractNum>
-  <w:abstractNum w:abstractNumId="22" w15:restartNumberingAfterBreak="0">
+  <w:abstractNum w:abstractNumId="28" w15:restartNumberingAfterBreak="0">
     <w:nsid w:val="6E7727D2"/>
     <w:multiLevelType w:val="multilevel"/>
     <w:tmpl w:val="BFEEA194"/>
@@ -5921,7 +7006,7 @@
       </w:rPr>
     </w:lvl>
   </w:abstractNum>
-  <w:abstractNum w:abstractNumId="23" w15:restartNumberingAfterBreak="0">
+  <w:abstractNum w:abstractNumId="29" w15:restartNumberingAfterBreak="0">
     <w:nsid w:val="73222923"/>
     <w:multiLevelType w:val="multilevel"/>
     <w:tmpl w:val="A9E676EC"/>
@@ -6070,7 +7155,156 @@
       </w:rPr>
     </w:lvl>
   </w:abstractNum>
-  <w:abstractNum w:abstractNumId="24" w15:restartNumberingAfterBreak="0">
+  <w:abstractNum w:abstractNumId="30" w15:restartNumberingAfterBreak="0">
+    <w:nsid w:val="751A496B"/>
+    <w:multiLevelType w:val="multilevel"/>
+    <w:tmpl w:val="AC84E72A"/>
+    <w:lvl w:ilvl="0">
+      <w:start w:val="1"/>
+      <w:numFmt w:val="bullet"/>
+      <w:lvlText w:val=""/>
+      <w:lvlJc w:val="left"/>
+      <w:pPr>
+        <w:tabs>
+          <w:tab w:val="num" w:pos="720"/>
+        </w:tabs>
+        <w:ind w:left="720" w:hanging="360"/>
+      </w:pPr>
+      <w:rPr>
+        <w:rFonts w:ascii="Symbol" w:hAnsi="Symbol" w:hint="default"/>
+        <w:sz w:val="20"/>
+      </w:rPr>
+    </w:lvl>
+    <w:lvl w:ilvl="1" w:tentative="1">
+      <w:start w:val="1"/>
+      <w:numFmt w:val="bullet"/>
+      <w:lvlText w:val="o"/>
+      <w:lvlJc w:val="left"/>
+      <w:pPr>
+        <w:tabs>
+          <w:tab w:val="num" w:pos="1440"/>
+        </w:tabs>
+        <w:ind w:left="1440" w:hanging="360"/>
+      </w:pPr>
+      <w:rPr>
+        <w:rFonts w:ascii="Courier New" w:hAnsi="Courier New" w:hint="default"/>
+        <w:sz w:val="20"/>
+      </w:rPr>
+    </w:lvl>
+    <w:lvl w:ilvl="2" w:tentative="1">
+      <w:start w:val="1"/>
+      <w:numFmt w:val="bullet"/>
+      <w:lvlText w:val=""/>
+      <w:lvlJc w:val="left"/>
+      <w:pPr>
+        <w:tabs>
+          <w:tab w:val="num" w:pos="2160"/>
+        </w:tabs>
+        <w:ind w:left="2160" w:hanging="360"/>
+      </w:pPr>
+      <w:rPr>
+        <w:rFonts w:ascii="Wingdings" w:hAnsi="Wingdings" w:hint="default"/>
+        <w:sz w:val="20"/>
+      </w:rPr>
+    </w:lvl>
+    <w:lvl w:ilvl="3" w:tentative="1">
+      <w:start w:val="1"/>
+      <w:numFmt w:val="bullet"/>
+      <w:lvlText w:val=""/>
+      <w:lvlJc w:val="left"/>
+      <w:pPr>
+        <w:tabs>
+          <w:tab w:val="num" w:pos="2880"/>
+        </w:tabs>
+        <w:ind w:left="2880" w:hanging="360"/>
+      </w:pPr>
+      <w:rPr>
+        <w:rFonts w:ascii="Wingdings" w:hAnsi="Wingdings" w:hint="default"/>
+        <w:sz w:val="20"/>
+      </w:rPr>
+    </w:lvl>
+    <w:lvl w:ilvl="4" w:tentative="1">
+      <w:start w:val="1"/>
+      <w:numFmt w:val="bullet"/>
+      <w:lvlText w:val=""/>
+      <w:lvlJc w:val="left"/>
+      <w:pPr>
+        <w:tabs>
+          <w:tab w:val="num" w:pos="3600"/>
+        </w:tabs>
+        <w:ind w:left="3600" w:hanging="360"/>
+      </w:pPr>
+      <w:rPr>
+        <w:rFonts w:ascii="Wingdings" w:hAnsi="Wingdings" w:hint="default"/>
+        <w:sz w:val="20"/>
+      </w:rPr>
+    </w:lvl>
+    <w:lvl w:ilvl="5" w:tentative="1">
+      <w:start w:val="1"/>
+      <w:numFmt w:val="bullet"/>
+      <w:lvlText w:val=""/>
+      <w:lvlJc w:val="left"/>
+      <w:pPr>
+        <w:tabs>
+          <w:tab w:val="num" w:pos="4320"/>
+        </w:tabs>
+        <w:ind w:left="4320" w:hanging="360"/>
+      </w:pPr>
+      <w:rPr>
+        <w:rFonts w:ascii="Wingdings" w:hAnsi="Wingdings" w:hint="default"/>
+        <w:sz w:val="20"/>
+      </w:rPr>
+    </w:lvl>
+    <w:lvl w:ilvl="6" w:tentative="1">
+      <w:start w:val="1"/>
+      <w:numFmt w:val="bullet"/>
+      <w:lvlText w:val=""/>
+      <w:lvlJc w:val="left"/>
+      <w:pPr>
+        <w:tabs>
+          <w:tab w:val="num" w:pos="5040"/>
+        </w:tabs>
+        <w:ind w:left="5040" w:hanging="360"/>
+      </w:pPr>
+      <w:rPr>
+        <w:rFonts w:ascii="Wingdings" w:hAnsi="Wingdings" w:hint="default"/>
+        <w:sz w:val="20"/>
+      </w:rPr>
+    </w:lvl>
+    <w:lvl w:ilvl="7" w:tentative="1">
+      <w:start w:val="1"/>
+      <w:numFmt w:val="bullet"/>
+      <w:lvlText w:val=""/>
+      <w:lvlJc w:val="left"/>
+      <w:pPr>
+        <w:tabs>
+          <w:tab w:val="num" w:pos="5760"/>
+        </w:tabs>
+        <w:ind w:left="5760" w:hanging="360"/>
+      </w:pPr>
+      <w:rPr>
+        <w:rFonts w:ascii="Wingdings" w:hAnsi="Wingdings" w:hint="default"/>
+        <w:sz w:val="20"/>
+      </w:rPr>
+    </w:lvl>
+    <w:lvl w:ilvl="8" w:tentative="1">
+      <w:start w:val="1"/>
+      <w:numFmt w:val="bullet"/>
+      <w:lvlText w:val=""/>
+      <w:lvlJc w:val="left"/>
+      <w:pPr>
+        <w:tabs>
+          <w:tab w:val="num" w:pos="6480"/>
+        </w:tabs>
+        <w:ind w:left="6480" w:hanging="360"/>
+      </w:pPr>
+      <w:rPr>
+        <w:rFonts w:ascii="Wingdings" w:hAnsi="Wingdings" w:hint="default"/>
+        <w:sz w:val="20"/>
+      </w:rPr>
+    </w:lvl>
+  </w:abstractNum>
+  <w:abstractNum w:abstractNumId="31" w15:restartNumberingAfterBreak="0">
     <w:nsid w:val="778C7A26"/>
     <w:multiLevelType w:val="multilevel"/>
     <w:tmpl w:val="CA8038C4"/>
@@ -6219,7 +7453,156 @@
       </w:rPr>
     </w:lvl>
   </w:abstractNum>
-  <w:abstractNum w:abstractNumId="25" w15:restartNumberingAfterBreak="0">
+  <w:abstractNum w:abstractNumId="32" w15:restartNumberingAfterBreak="0">
+    <w:nsid w:val="7BD72EE1"/>
+    <w:multiLevelType w:val="multilevel"/>
+    <w:tmpl w:val="3EF6F35C"/>
+    <w:lvl w:ilvl="0">
+      <w:start w:val="1"/>
+      <w:numFmt w:val="bullet"/>
+      <w:lvlText w:val=""/>
+      <w:lvlJc w:val="left"/>
+      <w:pPr>
+        <w:tabs>
+          <w:tab w:val="num" w:pos="720"/>
+        </w:tabs>
+        <w:ind w:left="720" w:hanging="360"/>
+      </w:pPr>
+      <w:rPr>
+        <w:rFonts w:ascii="Symbol" w:hAnsi="Symbol" w:hint="default"/>
+        <w:sz w:val="20"/>
+      </w:rPr>
+    </w:lvl>
+    <w:lvl w:ilvl="1" w:tentative="1">
+      <w:start w:val="1"/>
+      <w:numFmt w:val="bullet"/>
+      <w:lvlText w:val="o"/>
+      <w:lvlJc w:val="left"/>
+      <w:pPr>
+        <w:tabs>
+          <w:tab w:val="num" w:pos="1440"/>
+        </w:tabs>
+        <w:ind w:left="1440" w:hanging="360"/>
+      </w:pPr>
+      <w:rPr>
+        <w:rFonts w:ascii="Courier New" w:hAnsi="Courier New" w:hint="default"/>
+        <w:sz w:val="20"/>
+      </w:rPr>
+    </w:lvl>
+    <w:lvl w:ilvl="2" w:tentative="1">
+      <w:start w:val="1"/>
+      <w:numFmt w:val="bullet"/>
+      <w:lvlText w:val=""/>
+      <w:lvlJc w:val="left"/>
+      <w:pPr>
+        <w:tabs>
+          <w:tab w:val="num" w:pos="2160"/>
+        </w:tabs>
+        <w:ind w:left="2160" w:hanging="360"/>
+      </w:pPr>
+      <w:rPr>
+        <w:rFonts w:ascii="Wingdings" w:hAnsi="Wingdings" w:hint="default"/>
+        <w:sz w:val="20"/>
+      </w:rPr>
+    </w:lvl>
+    <w:lvl w:ilvl="3" w:tentative="1">
+      <w:start w:val="1"/>
+      <w:numFmt w:val="bullet"/>
+      <w:lvlText w:val=""/>
+      <w:lvlJc w:val="left"/>
+      <w:pPr>
+        <w:tabs>
+          <w:tab w:val="num" w:pos="2880"/>
+        </w:tabs>
+        <w:ind w:left="2880" w:hanging="360"/>
+      </w:pPr>
+      <w:rPr>
+        <w:rFonts w:ascii="Wingdings" w:hAnsi="Wingdings" w:hint="default"/>
+        <w:sz w:val="20"/>
+      </w:rPr>
+    </w:lvl>
+    <w:lvl w:ilvl="4" w:tentative="1">
+      <w:start w:val="1"/>
+      <w:numFmt w:val="bullet"/>
+      <w:lvlText w:val=""/>
+      <w:lvlJc w:val="left"/>
+      <w:pPr>
+        <w:tabs>
+          <w:tab w:val="num" w:pos="3600"/>
+        </w:tabs>
+        <w:ind w:left="3600" w:hanging="360"/>
+      </w:pPr>
+      <w:rPr>
+        <w:rFonts w:ascii="Wingdings" w:hAnsi="Wingdings" w:hint="default"/>
+        <w:sz w:val="20"/>
+      </w:rPr>
+    </w:lvl>
+    <w:lvl w:ilvl="5" w:tentative="1">
+      <w:start w:val="1"/>
+      <w:numFmt w:val="bullet"/>
+      <w:lvlText w:val=""/>
+      <w:lvlJc w:val="left"/>
+      <w:pPr>
+        <w:tabs>
+          <w:tab w:val="num" w:pos="4320"/>
+        </w:tabs>
+        <w:ind w:left="4320" w:hanging="360"/>
+      </w:pPr>
+      <w:rPr>
+        <w:rFonts w:ascii="Wingdings" w:hAnsi="Wingdings" w:hint="default"/>
+        <w:sz w:val="20"/>
+      </w:rPr>
+    </w:lvl>
+    <w:lvl w:ilvl="6" w:tentative="1">
+      <w:start w:val="1"/>
+      <w:numFmt w:val="bullet"/>
+      <w:lvlText w:val=""/>
+      <w:lvlJc w:val="left"/>
+      <w:pPr>
+        <w:tabs>
+          <w:tab w:val="num" w:pos="5040"/>
+        </w:tabs>
+        <w:ind w:left="5040" w:hanging="360"/>
+      </w:pPr>
+      <w:rPr>
+        <w:rFonts w:ascii="Wingdings" w:hAnsi="Wingdings" w:hint="default"/>
+        <w:sz w:val="20"/>
+      </w:rPr>
+    </w:lvl>
+    <w:lvl w:ilvl="7" w:tentative="1">
+      <w:start w:val="1"/>
+      <w:numFmt w:val="bullet"/>
+      <w:lvlText w:val=""/>
+      <w:lvlJc w:val="left"/>
+      <w:pPr>
+        <w:tabs>
+          <w:tab w:val="num" w:pos="5760"/>
+        </w:tabs>
+        <w:ind w:left="5760" w:hanging="360"/>
+      </w:pPr>
+      <w:rPr>
+        <w:rFonts w:ascii="Wingdings" w:hAnsi="Wingdings" w:hint="default"/>
+        <w:sz w:val="20"/>
+      </w:rPr>
+    </w:lvl>
+    <w:lvl w:ilvl="8" w:tentative="1">
+      <w:start w:val="1"/>
+      <w:numFmt w:val="bullet"/>
+      <w:lvlText w:val=""/>
+      <w:lvlJc w:val="left"/>
+      <w:pPr>
+        <w:tabs>
+          <w:tab w:val="num" w:pos="6480"/>
+        </w:tabs>
+        <w:ind w:left="6480" w:hanging="360"/>
+      </w:pPr>
+      <w:rPr>
+        <w:rFonts w:ascii="Wingdings" w:hAnsi="Wingdings" w:hint="default"/>
+        <w:sz w:val="20"/>
+      </w:rPr>
+    </w:lvl>
+  </w:abstractNum>
+  <w:abstractNum w:abstractNumId="33" w15:restartNumberingAfterBreak="0">
     <w:nsid w:val="7DAB67E8"/>
     <w:multiLevelType w:val="multilevel"/>
     <w:tmpl w:val="FADECDAA"/>
@@ -6369,82 +7752,106 @@
     </w:lvl>
   </w:abstractNum>
   <w:num w:numId="1" w16cid:durableId="1545753843">
+    <w:abstractNumId w:val="27"/>
+  </w:num>
+  <w:num w:numId="2" w16cid:durableId="1674915650">
+    <w:abstractNumId w:val="5"/>
+  </w:num>
+  <w:num w:numId="3" w16cid:durableId="827749270">
+    <w:abstractNumId w:val="17"/>
+  </w:num>
+  <w:num w:numId="4" w16cid:durableId="957108146">
+    <w:abstractNumId w:val="6"/>
+  </w:num>
+  <w:num w:numId="5" w16cid:durableId="984892561">
+    <w:abstractNumId w:val="12"/>
+  </w:num>
+  <w:num w:numId="6" w16cid:durableId="1639992800">
+    <w:abstractNumId w:val="16"/>
+  </w:num>
+  <w:num w:numId="7" w16cid:durableId="355011941">
+    <w:abstractNumId w:val="20"/>
+  </w:num>
+  <w:num w:numId="8" w16cid:durableId="1146164906">
+    <w:abstractNumId w:val="8"/>
+  </w:num>
+  <w:num w:numId="9" w16cid:durableId="2029720819">
+    <w:abstractNumId w:val="9"/>
+  </w:num>
+  <w:num w:numId="10" w16cid:durableId="466166368">
+    <w:abstractNumId w:val="28"/>
+  </w:num>
+  <w:num w:numId="11" w16cid:durableId="346181037">
+    <w:abstractNumId w:val="2"/>
+  </w:num>
+  <w:num w:numId="12" w16cid:durableId="606813353">
+    <w:abstractNumId w:val="11"/>
+  </w:num>
+  <w:num w:numId="13" w16cid:durableId="1659650998">
+    <w:abstractNumId w:val="25"/>
+  </w:num>
+  <w:num w:numId="14" w16cid:durableId="525365321">
     <w:abstractNumId w:val="21"/>
   </w:num>
-  <w:num w:numId="2" w16cid:durableId="1674915650">
-    <w:abstractNumId w:val="2"/>
+  <w:num w:numId="15" w16cid:durableId="1875073673">
+    <w:abstractNumId w:val="29"/>
   </w:num>
-  <w:num w:numId="3" w16cid:durableId="827749270">
-    <w:abstractNumId w:val="12"/>
+  <w:num w:numId="16" w16cid:durableId="1142044944">
+    <w:abstractNumId w:val="33"/>
   </w:num>
-  <w:num w:numId="4" w16cid:durableId="957108146">
+  <w:num w:numId="17" w16cid:durableId="1685666653">
+    <w:abstractNumId w:val="26"/>
+  </w:num>
+  <w:num w:numId="18" w16cid:durableId="1775981442">
+    <w:abstractNumId w:val="14"/>
+  </w:num>
+  <w:num w:numId="19" w16cid:durableId="89863364">
+    <w:abstractNumId w:val="31"/>
+  </w:num>
+  <w:num w:numId="20" w16cid:durableId="2014066719">
+    <w:abstractNumId w:val="1"/>
+  </w:num>
+  <w:num w:numId="21" w16cid:durableId="2001038984">
+    <w:abstractNumId w:val="15"/>
+  </w:num>
+  <w:num w:numId="22" w16cid:durableId="53043988">
+    <w:abstractNumId w:val="7"/>
+  </w:num>
+  <w:num w:numId="23" w16cid:durableId="1832866813">
+    <w:abstractNumId w:val="18"/>
+  </w:num>
+  <w:num w:numId="24" w16cid:durableId="1986078534">
+    <w:abstractNumId w:val="22"/>
+  </w:num>
+  <w:num w:numId="25" w16cid:durableId="842404338">
+    <w:abstractNumId w:val="23"/>
+  </w:num>
+  <w:num w:numId="26" w16cid:durableId="1462111578">
+    <w:abstractNumId w:val="19"/>
+  </w:num>
+  <w:num w:numId="27" w16cid:durableId="908267967">
+    <w:abstractNumId w:val="0"/>
+  </w:num>
+  <w:num w:numId="28" w16cid:durableId="1462965432">
     <w:abstractNumId w:val="3"/>
   </w:num>
-  <w:num w:numId="5" w16cid:durableId="984892561">
-    <w:abstractNumId w:val="8"/>
+  <w:num w:numId="29" w16cid:durableId="1417819622">
+    <w:abstractNumId w:val="32"/>
   </w:num>
-  <w:num w:numId="6" w16cid:durableId="1639992800">
-    <w:abstractNumId w:val="11"/>
-  </w:num>
-  <w:num w:numId="7" w16cid:durableId="355011941">
-    <w:abstractNumId w:val="15"/>
-  </w:num>
-  <w:num w:numId="8" w16cid:durableId="1146164906">
-    <w:abstractNumId w:val="5"/>
-  </w:num>
-  <w:num w:numId="9" w16cid:durableId="2029720819">
-    <w:abstractNumId w:val="6"/>
-  </w:num>
-  <w:num w:numId="10" w16cid:durableId="466166368">
-    <w:abstractNumId w:val="22"/>
-  </w:num>
-  <w:num w:numId="11" w16cid:durableId="346181037">
-    <w:abstractNumId w:val="1"/>
-  </w:num>
-  <w:num w:numId="12" w16cid:durableId="606813353">
-    <w:abstractNumId w:val="7"/>
-  </w:num>
-  <w:num w:numId="13" w16cid:durableId="1659650998">
-    <w:abstractNumId w:val="19"/>
-  </w:num>
-  <w:num w:numId="14" w16cid:durableId="525365321">
-    <w:abstractNumId w:val="16"/>
-  </w:num>
-  <w:num w:numId="15" w16cid:durableId="1875073673">
-    <w:abstractNumId w:val="23"/>
-  </w:num>
-  <w:num w:numId="16" w16cid:durableId="1142044944">
-    <w:abstractNumId w:val="25"/>
-  </w:num>
-  <w:num w:numId="17" w16cid:durableId="1685666653">
-    <w:abstractNumId w:val="20"/>
-  </w:num>
-  <w:num w:numId="18" w16cid:durableId="1775981442">
-    <w:abstractNumId w:val="9"/>
-  </w:num>
-  <w:num w:numId="19" w16cid:durableId="89863364">
+  <w:num w:numId="30" w16cid:durableId="1052576479">
     <w:abstractNumId w:val="24"/>
   </w:num>
-  <w:num w:numId="20" w16cid:durableId="2014066719">
-    <w:abstractNumId w:val="0"/>
-  </w:num>
-  <w:num w:numId="21" w16cid:durableId="2001038984">
-    <w:abstractNumId w:val="10"/>
-  </w:num>
-  <w:num w:numId="22" w16cid:durableId="53043988">
+  <w:num w:numId="31" w16cid:durableId="1270702386">
     <w:abstractNumId w:val="4"/>
   </w:num>
-  <w:num w:numId="23" w16cid:durableId="1832866813">
+  <w:num w:numId="32" w16cid:durableId="1717729292">
+    <w:abstractNumId w:val="30"/>
+  </w:num>
+  <w:num w:numId="33" w16cid:durableId="1142772778">
     <w:abstractNumId w:val="13"/>
   </w:num>
-  <w:num w:numId="24" w16cid:durableId="1986078534">
-    <w:abstractNumId w:val="17"/>
-  </w:num>
-  <w:num w:numId="25" w16cid:durableId="842404338">
-    <w:abstractNumId w:val="18"/>
-  </w:num>
-  <w:num w:numId="26" w16cid:durableId="1462111578">
-    <w:abstractNumId w:val="14"/>
+  <w:num w:numId="34" w16cid:durableId="108477935">
+    <w:abstractNumId w:val="10"/>
   </w:num>
   <w:numIdMacAtCleanup w:val="25"/>
 </w:numbering>
@@ -6992,7 +8399,6 @@
   <w:style w:type="character" w:default="1" w:styleId="Fuentedeprrafopredeter">
     <w:name w:val="Default Paragraph Font"/>
     <w:uiPriority w:val="1"/>
-    <w:semiHidden/>
     <w:unhideWhenUsed/>
   </w:style>
   <w:style w:type="table" w:default="1" w:styleId="Tablanormal">

</xml_diff>

<commit_message>
inicio de sesión y creación de usuarios
</commit_message>
<xml_diff>
--- a/RequerimientosFuncionales.docx
+++ b/RequerimientosFuncionales.docx
@@ -2144,6 +2144,12 @@
       </w:r>
     </w:p>
     <w:p>
+      <w:pPr>
+        <w:rPr>
+          <w:b/>
+          <w:bCs/>
+        </w:rPr>
+      </w:pPr>
       <w:r>
         <w:rPr>
           <w:b/>
@@ -2164,10 +2170,25 @@
           <w:b/>
           <w:bCs/>
         </w:rPr>
-        <w:t>RFA-001 - Panel de Control:</w:t>
-      </w:r>
-      <w:r>
-        <w:t xml:space="preserve"> El sistema deberá permitir al Personal de SECTURZ la administración integral de los participantes registrados mediante un panel de control privado (Dashboard).</w:t>
+        <w:t>RFA-001 – Inicio de Sesión Administrativo:</w:t>
+      </w:r>
+      <w:r>
+        <w:t xml:space="preserve"> El sistema deberá permitir al Personal de SECTURZ iniciar sesión mediante un usuario y contraseña </w:t>
+      </w:r>
+      <w:r>
+        <w:t>p</w:t>
+      </w:r>
+      <w:r>
+        <w:t xml:space="preserve">ara </w:t>
+      </w:r>
+      <w:r>
+        <w:t xml:space="preserve">acceder a </w:t>
+      </w:r>
+      <w:r>
+        <w:t>las funciones del panel de control.</w:t>
+      </w:r>
+      <w:r>
+        <w:t xml:space="preserve"> </w:t>
       </w:r>
     </w:p>
     <w:p>
@@ -2182,10 +2203,24 @@
           <w:b/>
           <w:bCs/>
         </w:rPr>
-        <w:t>RFA-002 - Búsqueda y Filtrado:</w:t>
-      </w:r>
-      <w:r>
-        <w:t xml:space="preserve"> El sistema deberá permitir al Personal de SECTURZ la consulta de registros de participantes mediante filtros por folio, nombre, correo electrónico o número telefónico.</w:t>
+        <w:t>RFA-00</w:t>
+      </w:r>
+      <w:r>
+        <w:rPr>
+          <w:b/>
+          <w:bCs/>
+        </w:rPr>
+        <w:t>2</w:t>
+      </w:r>
+      <w:r>
+        <w:rPr>
+          <w:b/>
+          <w:bCs/>
+        </w:rPr>
+        <w:t xml:space="preserve"> - Panel de Control:</w:t>
+      </w:r>
+      <w:r>
+        <w:t xml:space="preserve"> El sistema deberá permitir al Personal de SECTURZ la administración integral de los participantes registrados mediante un panel de control privado (Dashboard).</w:t>
       </w:r>
     </w:p>
     <w:p>
@@ -2200,10 +2235,24 @@
           <w:b/>
           <w:bCs/>
         </w:rPr>
-        <w:t>RFA-003 - Edición de Registros:</w:t>
-      </w:r>
-      <w:r>
-        <w:t xml:space="preserve"> El sistema deberá permitir al Personal de SECTURZ editar la información de los registros de los participantes antes de la realización del evento.</w:t>
+        <w:t>RFA-00</w:t>
+      </w:r>
+      <w:r>
+        <w:rPr>
+          <w:b/>
+          <w:bCs/>
+        </w:rPr>
+        <w:t>3</w:t>
+      </w:r>
+      <w:r>
+        <w:rPr>
+          <w:b/>
+          <w:bCs/>
+        </w:rPr>
+        <w:t>- Búsqueda y Filtrado:</w:t>
+      </w:r>
+      <w:r>
+        <w:t xml:space="preserve"> El sistema deberá permitir al Personal de SECTURZ la consulta de registros de participantes mediante filtros por folio, nombre, correo electrónico o número telefónico.</w:t>
       </w:r>
     </w:p>
     <w:p>
@@ -2218,10 +2267,24 @@
           <w:b/>
           <w:bCs/>
         </w:rPr>
-        <w:t>RFA-004 - Cancelación de Registros:</w:t>
-      </w:r>
-      <w:r>
-        <w:t xml:space="preserve"> El sistema deberá permitir al Personal de SECTURZ cancelar registros de participantes cuando sea necesario o solicitado.</w:t>
+        <w:t>RFA-00</w:t>
+      </w:r>
+      <w:r>
+        <w:rPr>
+          <w:b/>
+          <w:bCs/>
+        </w:rPr>
+        <w:t>4</w:t>
+      </w:r>
+      <w:r>
+        <w:rPr>
+          <w:b/>
+          <w:bCs/>
+        </w:rPr>
+        <w:t xml:space="preserve"> - Edición de Registros:</w:t>
+      </w:r>
+      <w:r>
+        <w:t xml:space="preserve"> El sistema deberá permitir al Personal de SECTURZ editar la información de los registros de los participantes antes de la realización del evento.</w:t>
       </w:r>
     </w:p>
     <w:p>
@@ -2237,10 +2300,24 @@
           <w:bCs/>
         </w:rPr>
         <w:lastRenderedPageBreak/>
-        <w:t>RFA-005 - Configuración de Campos:</w:t>
-      </w:r>
-      <w:r>
-        <w:t xml:space="preserve"> El sistema deberá permitir al Personal de SECTURZ configure los datos solicitados en el formulario de registro según las necesidades del evento.</w:t>
+        <w:t>RFA-00</w:t>
+      </w:r>
+      <w:r>
+        <w:rPr>
+          <w:b/>
+          <w:bCs/>
+        </w:rPr>
+        <w:t>5</w:t>
+      </w:r>
+      <w:r>
+        <w:rPr>
+          <w:b/>
+          <w:bCs/>
+        </w:rPr>
+        <w:t xml:space="preserve"> - Cancelación de Registros:</w:t>
+      </w:r>
+      <w:r>
+        <w:t xml:space="preserve"> El sistema deberá permitir al Personal de SECTURZ cancelar registros de participantes cuando sea necesario o solicitado.</w:t>
       </w:r>
     </w:p>
     <w:p>
@@ -2255,10 +2332,24 @@
           <w:b/>
           <w:bCs/>
         </w:rPr>
-        <w:t>RFA-006 - Exportación de Datos:</w:t>
-      </w:r>
-      <w:r>
-        <w:t xml:space="preserve"> El sistema deberá permitir al Personal de SECTURZ la exportación de los registros de participantes en formatos compatibles con hojas de cálculo (ej. CSV, XLSX).</w:t>
+        <w:t>RFA-00</w:t>
+      </w:r>
+      <w:r>
+        <w:rPr>
+          <w:b/>
+          <w:bCs/>
+        </w:rPr>
+        <w:t>6</w:t>
+      </w:r>
+      <w:r>
+        <w:rPr>
+          <w:b/>
+          <w:bCs/>
+        </w:rPr>
+        <w:t xml:space="preserve"> - Configuración de Campos:</w:t>
+      </w:r>
+      <w:r>
+        <w:t xml:space="preserve"> El sistema deberá permitir al Personal de SECTURZ configure los datos solicitados en el formulario de registro según las necesidades del evento.</w:t>
       </w:r>
     </w:p>
     <w:p>
@@ -2273,10 +2364,24 @@
           <w:b/>
           <w:bCs/>
         </w:rPr>
-        <w:t>RFA-007 - Monitoreo en Tiempo Real:</w:t>
-      </w:r>
-      <w:r>
-        <w:t xml:space="preserve"> El sistema deberá permitir al Personal de SECTURZ visualizar en tiempo real la lista de participantes que van registrando su asistencia en campo.</w:t>
+        <w:t>RFA-00</w:t>
+      </w:r>
+      <w:r>
+        <w:rPr>
+          <w:b/>
+          <w:bCs/>
+        </w:rPr>
+        <w:t>7</w:t>
+      </w:r>
+      <w:r>
+        <w:rPr>
+          <w:b/>
+          <w:bCs/>
+        </w:rPr>
+        <w:t xml:space="preserve"> - Exportación de Datos:</w:t>
+      </w:r>
+      <w:r>
+        <w:t xml:space="preserve"> El sistema deberá permitir al Personal de SECTURZ la exportación de los registros de participantes en formatos compatibles con hojas de cálculo (ej. CSV, XLSX).</w:t>
       </w:r>
     </w:p>
     <w:p>
@@ -2291,10 +2396,24 @@
           <w:b/>
           <w:bCs/>
         </w:rPr>
-        <w:t>RFA-008 - Consulta Estadísticas:</w:t>
-      </w:r>
-      <w:r>
-        <w:t xml:space="preserve"> El sistema deberá permitir al Personal de SECTURZ consultar estadísticas gráficas de participantes registrados y asistentes confirmados.</w:t>
+        <w:t>RFA-00</w:t>
+      </w:r>
+      <w:r>
+        <w:rPr>
+          <w:b/>
+          <w:bCs/>
+        </w:rPr>
+        <w:t>8</w:t>
+      </w:r>
+      <w:r>
+        <w:rPr>
+          <w:b/>
+          <w:bCs/>
+        </w:rPr>
+        <w:t xml:space="preserve"> - Monitoreo en Tiempo Real:</w:t>
+      </w:r>
+      <w:r>
+        <w:t xml:space="preserve"> El sistema deberá permitir al Personal de SECTURZ visualizar en tiempo real la lista de participantes que van registrando su asistencia en campo.</w:t>
       </w:r>
     </w:p>
     <w:p>
@@ -2309,10 +2428,24 @@
           <w:b/>
           <w:bCs/>
         </w:rPr>
-        <w:t>RFA-009 - Reportes de Asistencia:</w:t>
-      </w:r>
-      <w:r>
-        <w:t xml:space="preserve"> El sistema deberá permitir al Personal de SECTURZ generar reportes consolidados de participación y asistencia general de la cabalgata.</w:t>
+        <w:t>RFA-00</w:t>
+      </w:r>
+      <w:r>
+        <w:rPr>
+          <w:b/>
+          <w:bCs/>
+        </w:rPr>
+        <w:t>9</w:t>
+      </w:r>
+      <w:r>
+        <w:rPr>
+          <w:b/>
+          <w:bCs/>
+        </w:rPr>
+        <w:t xml:space="preserve"> - Consulta Estadísticas:</w:t>
+      </w:r>
+      <w:r>
+        <w:t xml:space="preserve"> El sistema deberá permitir al Personal de SECTURZ consultar estadísticas gráficas de participantes registrados y asistentes confirmados.</w:t>
       </w:r>
     </w:p>
     <w:p>
@@ -2327,7 +2460,53 @@
           <w:b/>
           <w:bCs/>
         </w:rPr>
-        <w:t>RFA-010 - Identificación de Inasistencias:</w:t>
+        <w:t>RFA-0</w:t>
+      </w:r>
+      <w:r>
+        <w:rPr>
+          <w:b/>
+          <w:bCs/>
+        </w:rPr>
+        <w:t>10</w:t>
+      </w:r>
+      <w:r>
+        <w:rPr>
+          <w:b/>
+          <w:bCs/>
+        </w:rPr>
+        <w:t xml:space="preserve"> - Reportes de Asistencia:</w:t>
+      </w:r>
+      <w:r>
+        <w:t xml:space="preserve"> El sistema deberá permitir al Personal de SECTURZ generar reportes consolidados de participación y asistencia general de la cabalgata.</w:t>
+      </w:r>
+    </w:p>
+    <w:p>
+      <w:pPr>
+        <w:numPr>
+          <w:ilvl w:val="0"/>
+          <w:numId w:val="32"/>
+        </w:numPr>
+      </w:pPr>
+      <w:r>
+        <w:rPr>
+          <w:b/>
+          <w:bCs/>
+        </w:rPr>
+        <w:t>RFA-01</w:t>
+      </w:r>
+      <w:r>
+        <w:rPr>
+          <w:b/>
+          <w:bCs/>
+        </w:rPr>
+        <w:t>1</w:t>
+      </w:r>
+      <w:r>
+        <w:rPr>
+          <w:b/>
+          <w:bCs/>
+        </w:rPr>
+        <w:t xml:space="preserve"> - Identificación de Inasistencias:</w:t>
       </w:r>
       <w:r>
         <w:t xml:space="preserve"> El sistema deberá permitir al Personal de SECTURZ identificar y filtrar a los participantes que se inscribieron pero no realizaron el registro de asistencia el día del evento.</w:t>

</xml_diff>